<commit_message>
Modelo POP v3 novo, campo Elaborado por, download em PDF e fim dos exemplos
- Modelo atualizado (título, ícones, faixa, Históricos de Revisões, print + caixa Passo N:);
  template e imagens regenerados por npm run modelo-pop
- Campo pops.autor (Elaborado por), preenchido pela pessoa até o login existir
- PDF gerado com pdfmake (lib/pop/pdf.ts), mesmo conteúdo do DOCX; botão Baixar PDF
- Fluxograma de exemplo (EmCash) e textos de exemplo removidos

Co-Authored-By: Claude Fable 5.1 <noreply@anthropic.com>
Claude-Session: https://claude.ai/code/session_01WmX1FeLej794b7ZZRcPkyZ
</commit_message>
<xml_diff>
--- a/templates/pop/Modelo_POP_v3.docx
+++ b/templates/pop/Modelo_POP_v3.docx
@@ -1,6 +1,6 @@
 
 <file path=word/document.xml><?xml version="1.0" encoding="utf-8"?>
-<w:document xmlns:wpc="http://schemas.microsoft.com/office/word/2010/wordprocessingCanvas" xmlns:cx="http://schemas.microsoft.com/office/drawing/2014/chartex" xmlns:cx1="http://schemas.microsoft.com/office/drawing/2015/9/8/chartex" xmlns:cx2="http://schemas.microsoft.com/office/drawing/2015/10/21/chartex" xmlns:cx3="http://schemas.microsoft.com/office/drawing/2016/5/9/chartex" xmlns:cx4="http://schemas.microsoft.com/office/drawing/2016/5/10/chartex" xmlns:cx5="http://schemas.microsoft.com/office/drawing/2016/5/11/chartex" xmlns:cx6="http://schemas.microsoft.com/office/drawing/2016/5/12/chartex" xmlns:cx7="http://schemas.microsoft.com/office/drawing/2016/5/13/chartex" xmlns:cx8="http://schemas.microsoft.com/office/drawing/2016/5/14/chartex" xmlns:mc="http://schemas.openxmlformats.org/markup-compatibility/2006" xmlns:aink="http://schemas.microsoft.com/office/drawing/2016/ink" xmlns:am3d="http://schemas.microsoft.com/office/drawing/2017/model3d" xmlns:o="urn:schemas-microsoft-com:office:office" xmlns:oel="http://schemas.microsoft.com/office/2019/extlst" xmlns:r="http://schemas.openxmlformats.org/officeDocument/2006/relationships" xmlns:m="http://schemas.openxmlformats.org/officeDocument/2006/math" xmlns:v="urn:schemas-microsoft-com:vml" xmlns:wp14="http://schemas.microsoft.com/office/word/2010/wordprocessingDrawing" xmlns:wp="http://schemas.openxmlformats.org/drawingml/2006/wordprocessingDrawing" xmlns:w10="urn:schemas-microsoft-com:office:word" xmlns:w="http://schemas.openxmlformats.org/wordprocessingml/2006/main" xmlns:w14="http://schemas.microsoft.com/office/word/2010/wordml" xmlns:w15="http://schemas.microsoft.com/office/word/2012/wordml" xmlns:w16cei="http://schemas.microsoft.com/office/word/2026/wordml/cei" xmlns:w16cex="http://schemas.microsoft.com/office/word/2018/wordml/cex" xmlns:w16cid="http://schemas.microsoft.com/office/word/2016/wordml/cid" xmlns:w16="http://schemas.microsoft.com/office/word/2018/wordml" xmlns:w16du="http://schemas.microsoft.com/office/word/2023/wordml/word16du" xmlns:w16sdtdh="http://schemas.microsoft.com/office/word/2020/wordml/sdtdatahash" xmlns:w16sdtfl="http://schemas.microsoft.com/office/word/2024/wordml/sdtformatlock" xmlns:w16se="http://schemas.microsoft.com/office/word/2015/wordml/symex" xmlns:wpg="http://schemas.microsoft.com/office/word/2010/wordprocessingGroup" xmlns:wpi="http://schemas.microsoft.com/office/word/2010/wordprocessingInk" xmlns:wne="http://schemas.microsoft.com/office/word/2006/wordml" xmlns:wps="http://schemas.microsoft.com/office/word/2010/wordprocessingShape" mc:Ignorable="w14 w15 w16se w16cid w16 w16cex w16sdtdh w16sdtfl w16du wp14">
+<w:document xmlns:wpc="http://schemas.microsoft.com/office/word/2010/wordprocessingCanvas" xmlns:cx="http://schemas.microsoft.com/office/drawing/2014/chartex" xmlns:cx1="http://schemas.microsoft.com/office/drawing/2015/9/8/chartex" xmlns:cx2="http://schemas.microsoft.com/office/drawing/2015/10/21/chartex" xmlns:cx3="http://schemas.microsoft.com/office/drawing/2016/5/9/chartex" xmlns:cx4="http://schemas.microsoft.com/office/drawing/2016/5/10/chartex" xmlns:cx5="http://schemas.microsoft.com/office/drawing/2016/5/11/chartex" xmlns:cx6="http://schemas.microsoft.com/office/drawing/2016/5/12/chartex" xmlns:cx7="http://schemas.microsoft.com/office/drawing/2016/5/13/chartex" xmlns:cx8="http://schemas.microsoft.com/office/drawing/2016/5/14/chartex" xmlns:mc="http://schemas.openxmlformats.org/markup-compatibility/2006" xmlns:aink="http://schemas.microsoft.com/office/drawing/2016/ink" xmlns:am3d="http://schemas.microsoft.com/office/drawing/2017/model3d" xmlns:o="urn:schemas-microsoft-com:office:office" xmlns:oel="http://schemas.microsoft.com/office/2019/extlst" xmlns:r="http://schemas.openxmlformats.org/officeDocument/2006/relationships" xmlns:m="http://schemas.openxmlformats.org/officeDocument/2006/math" xmlns:v="urn:schemas-microsoft-com:vml" xmlns:wp14="http://schemas.microsoft.com/office/word/2010/wordprocessingDrawing" xmlns:wp="http://schemas.openxmlformats.org/drawingml/2006/wordprocessingDrawing" xmlns:w10="urn:schemas-microsoft-com:office:word" xmlns:w="http://schemas.openxmlformats.org/wordprocessingml/2006/main" xmlns:w14="http://schemas.microsoft.com/office/word/2010/wordml" xmlns:w15="http://schemas.microsoft.com/office/word/2012/wordml" xmlns:w16cex="http://schemas.microsoft.com/office/word/2018/wordml/cex" xmlns:w16cid="http://schemas.microsoft.com/office/word/2016/wordml/cid" xmlns:w16="http://schemas.microsoft.com/office/word/2018/wordml" xmlns:w16du="http://schemas.microsoft.com/office/word/2023/wordml/word16du" xmlns:w16sdtdh="http://schemas.microsoft.com/office/word/2020/wordml/sdtdatahash" xmlns:w16sdtfl="http://schemas.microsoft.com/office/word/2024/wordml/sdtformatlock" xmlns:w16se="http://schemas.microsoft.com/office/word/2015/wordml/symex" xmlns:wpg="http://schemas.microsoft.com/office/word/2010/wordprocessingGroup" xmlns:wpi="http://schemas.microsoft.com/office/word/2010/wordprocessingInk" xmlns:wne="http://schemas.microsoft.com/office/word/2006/wordml" xmlns:wps="http://schemas.microsoft.com/office/word/2010/wordprocessingShape" mc:Ignorable="w14 w15 w16se w16cid w16 w16cex w16sdtdh w16sdtfl w16du wp14">
   <w:body>
     <w:p>
       <w:pPr>
@@ -11,7 +11,87 @@
           <w:noProof/>
         </w:rPr>
         <w:drawing>
-          <wp:inline distT="0" distB="0" distL="0" distR="0" wp14:anchorId="16CDB000" wp14:editId="54788B7B">
+          <wp:anchor distT="0" distB="0" distL="114300" distR="114300" simplePos="0" relativeHeight="251677696" behindDoc="1" locked="0" layoutInCell="1" allowOverlap="1" wp14:anchorId="3BF3F416" wp14:editId="391912C9">
+            <wp:simplePos x="0" y="0"/>
+            <wp:positionH relativeFrom="margin">
+              <wp:posOffset>11430</wp:posOffset>
+            </wp:positionH>
+            <wp:positionV relativeFrom="paragraph">
+              <wp:posOffset>1905</wp:posOffset>
+            </wp:positionV>
+            <wp:extent cx="6947535" cy="967067"/>
+            <wp:effectExtent l="0" t="0" r="0" b="5080"/>
+            <wp:wrapNone/>
+            <wp:docPr id="624437393" name="Picture 12"/>
+            <wp:cNvGraphicFramePr>
+              <a:graphicFrameLocks xmlns:a="http://schemas.openxmlformats.org/drawingml/2006/main" noChangeAspect="1"/>
+            </wp:cNvGraphicFramePr>
+            <a:graphic xmlns:a="http://schemas.openxmlformats.org/drawingml/2006/main">
+              <a:graphicData uri="http://schemas.openxmlformats.org/drawingml/2006/picture">
+                <pic:pic xmlns:pic="http://schemas.openxmlformats.org/drawingml/2006/picture">
+                  <pic:nvPicPr>
+                    <pic:cNvPr id="0" name="Picture 16"/>
+                    <pic:cNvPicPr>
+                      <a:picLocks noChangeAspect="1" noChangeArrowheads="1"/>
+                    </pic:cNvPicPr>
+                  </pic:nvPicPr>
+                  <pic:blipFill rotWithShape="1">
+                    <a:blip r:embed="rId7">
+                      <a:duotone>
+                        <a:schemeClr val="bg2">
+                          <a:shade val="45000"/>
+                          <a:satMod val="135000"/>
+                        </a:schemeClr>
+                        <a:prstClr val="white"/>
+                      </a:duotone>
+                      <a:alphaModFix amt="85000"/>
+                      <a:extLst>
+                        <a:ext uri="{28A0092B-C50C-407E-A947-70E740481C1C}">
+                          <a14:useLocalDpi xmlns:a14="http://schemas.microsoft.com/office/drawing/2010/main" val="0"/>
+                        </a:ext>
+                      </a:extLst>
+                    </a:blip>
+                    <a:srcRect t="88156" b="4014"/>
+                    <a:stretch>
+                      <a:fillRect/>
+                    </a:stretch>
+                  </pic:blipFill>
+                  <pic:spPr bwMode="auto">
+                    <a:xfrm>
+                      <a:off x="0" y="0"/>
+                      <a:ext cx="6948160" cy="967154"/>
+                    </a:xfrm>
+                    <a:prstGeom prst="rect">
+                      <a:avLst/>
+                    </a:prstGeom>
+                    <a:noFill/>
+                    <a:ln>
+                      <a:noFill/>
+                    </a:ln>
+                    <a:extLst>
+                      <a:ext uri="{53640926-AAD7-44D8-BBD7-CCE9431645EC}">
+                        <a14:shadowObscured xmlns:a14="http://schemas.microsoft.com/office/drawing/2010/main"/>
+                      </a:ext>
+                    </a:extLst>
+                  </pic:spPr>
+                </pic:pic>
+              </a:graphicData>
+            </a:graphic>
+            <wp14:sizeRelH relativeFrom="page">
+              <wp14:pctWidth>0</wp14:pctWidth>
+            </wp14:sizeRelH>
+            <wp14:sizeRelV relativeFrom="page">
+              <wp14:pctHeight>0</wp14:pctHeight>
+            </wp14:sizeRelV>
+          </wp:anchor>
+        </w:drawing>
+      </w:r>
+      <w:r>
+        <w:rPr>
+          <w:noProof/>
+        </w:rPr>
+        <w:drawing>
+          <wp:inline distT="0" distB="0" distL="0" distR="0" wp14:anchorId="16CDB000" wp14:editId="6B4ED056">
             <wp:extent cx="1566756" cy="855134"/>
             <wp:effectExtent l="57150" t="57150" r="52705" b="59690"/>
             <wp:docPr id="882951861" name="Picture 5"/>
@@ -26,7 +106,7 @@
                     <pic:cNvPicPr/>
                   </pic:nvPicPr>
                   <pic:blipFill>
-                    <a:blip r:embed="rId7" cstate="print">
+                    <a:blip r:embed="rId8" cstate="print">
                       <a:extLst>
                         <a:ext uri="{28A0092B-C50C-407E-A947-70E740481C1C}">
                           <a14:useLocalDpi xmlns:a14="http://schemas.microsoft.com/office/drawing/2010/main" val="0"/>
@@ -47,7 +127,7 @@
                     </a:prstGeom>
                     <a:ln w="50800" cap="sq">
                       <a:solidFill>
-                        <a:schemeClr val="tx1"/>
+                        <a:srgbClr val="0D0D0B"/>
                       </a:solidFill>
                     </a:ln>
                     <a:effectLst>
@@ -67,6 +147,7 @@
     <w:p>
       <w:pPr>
         <w:pStyle w:val="Header"/>
+        <w:spacing w:line="360" w:lineRule="auto"/>
         <w:rPr>
           <w:b/>
           <w:bCs/>
@@ -78,11 +159,50 @@
     <w:p>
       <w:pPr>
         <w:pStyle w:val="Header"/>
-        <w:spacing w:line="276" w:lineRule="auto"/>
+        <w:spacing w:line="360" w:lineRule="auto"/>
         <w:rPr>
           <w:color w:val="0E2841" w:themeColor="text2"/>
           <w:sz w:val="40"/>
           <w:szCs w:val="40"/>
+        </w:rPr>
+      </w:pPr>
+      <w:r>
+        <w:rPr>
+          <w:b/>
+          <w:bCs/>
+          <w:color w:val="0E2841" w:themeColor="text2"/>
+          <w:sz w:val="40"/>
+          <w:szCs w:val="40"/>
+        </w:rPr>
+        <w:t>POP</w:t>
+      </w:r>
+      <w:r>
+        <w:rPr>
+          <w:color w:val="0E2841" w:themeColor="text2"/>
+          <w:sz w:val="40"/>
+          <w:szCs w:val="40"/>
+        </w:rPr>
+        <w:t xml:space="preserve"> - </w:t>
+      </w:r>
+      <w:r>
+        <w:rPr>
+          <w:color w:val="0E2841" w:themeColor="text2"/>
+          <w:sz w:val="40"/>
+          <w:szCs w:val="40"/>
+        </w:rPr>
+        <w:t>Procedimento Operacional Padrão</w:t>
+      </w:r>
+    </w:p>
+    <w:p>
+      <w:pPr>
+        <w:pStyle w:val="Header"/>
+        <w:spacing w:line="276" w:lineRule="auto"/>
+        <w:rPr>
+          <w:b/>
+          <w:bCs/>
+          <w:color w:val="0E2841" w:themeColor="text2"/>
+          <w:sz w:val="50"/>
+          <w:szCs w:val="50"/>
         </w:rPr>
       </w:pPr>
       <w:r>
@@ -93,13 +213,13 @@
           <w:szCs w:val="40"/>
         </w:rPr>
         <w:drawing>
-          <wp:anchor distT="0" distB="0" distL="114300" distR="114300" simplePos="0" relativeHeight="251667456" behindDoc="0" locked="0" layoutInCell="1" allowOverlap="1" wp14:anchorId="3FFD03DB" wp14:editId="746A7D94">
+          <wp:anchor distT="0" distB="0" distL="114300" distR="114300" simplePos="0" relativeHeight="251667456" behindDoc="0" locked="0" layoutInCell="1" allowOverlap="1" wp14:anchorId="3FFD03DB" wp14:editId="29C048CF">
             <wp:simplePos x="0" y="0"/>
             <wp:positionH relativeFrom="column">
-              <wp:posOffset>41910</wp:posOffset>
+              <wp:posOffset>57785</wp:posOffset>
             </wp:positionH>
             <wp:positionV relativeFrom="paragraph">
-              <wp:posOffset>389255</wp:posOffset>
+              <wp:posOffset>47625</wp:posOffset>
             </wp:positionV>
             <wp:extent cx="304800" cy="304800"/>
             <wp:effectExtent l="0" t="0" r="0" b="0"/>
@@ -116,7 +236,7 @@
                     <pic:cNvPicPr/>
                   </pic:nvPicPr>
                   <pic:blipFill>
-                    <a:blip r:embed="rId8" cstate="print">
+                    <a:blip r:embed="rId9">
                       <a:extLst>
                         <a:ext uri="{28A0092B-C50C-407E-A947-70E740481C1C}">
                           <a14:useLocalDpi xmlns:a14="http://schemas.microsoft.com/office/drawing/2010/main" val="0"/>
@@ -150,27 +270,6 @@
       </w:r>
       <w:r>
         <w:rPr>
-          <w:color w:val="0E2841" w:themeColor="text2"/>
-          <w:sz w:val="40"/>
-          <w:szCs w:val="40"/>
-        </w:rPr>
-        <w:t>Procedimento Operacional Padrão</w:t>
-      </w:r>
-    </w:p>
-    <w:p>
-      <w:pPr>
-        <w:pStyle w:val="Header"/>
-        <w:spacing w:line="276" w:lineRule="auto"/>
-        <w:rPr>
-          <w:b/>
-          <w:bCs/>
-          <w:color w:val="0E2841" w:themeColor="text2"/>
-          <w:sz w:val="50"/>
-          <w:szCs w:val="50"/>
-        </w:rPr>
-      </w:pPr>
-      <w:r>
-        <w:rPr>
           <w:b/>
           <w:bCs/>
           <w:color w:val="0E2841" w:themeColor="text2"/>
@@ -192,6 +291,71 @@
           <w:szCs w:val="36"/>
         </w:rPr>
       </w:pPr>
+      <w:r>
+        <w:rPr>
+          <w:b/>
+          <w:bCs/>
+          <w:noProof/>
+          <w:color w:val="0E2841" w:themeColor="text2"/>
+          <w:sz w:val="36"/>
+          <w:szCs w:val="36"/>
+        </w:rPr>
+        <w:drawing>
+          <wp:anchor distT="0" distB="0" distL="114300" distR="114300" simplePos="0" relativeHeight="251678720" behindDoc="0" locked="0" layoutInCell="1" allowOverlap="1" wp14:anchorId="0B0A6074" wp14:editId="5EBA2ECE">
+            <wp:simplePos x="0" y="0"/>
+            <wp:positionH relativeFrom="column">
+              <wp:posOffset>-1270</wp:posOffset>
+            </wp:positionH>
+            <wp:positionV relativeFrom="paragraph">
+              <wp:posOffset>431800</wp:posOffset>
+            </wp:positionV>
+            <wp:extent cx="236220" cy="236220"/>
+            <wp:effectExtent l="0" t="0" r="0" b="0"/>
+            <wp:wrapSquare wrapText="bothSides"/>
+            <wp:docPr id="1736515702" name="Picture 5"/>
+            <wp:cNvGraphicFramePr>
+              <a:graphicFrameLocks xmlns:a="http://schemas.openxmlformats.org/drawingml/2006/main" noChangeAspect="1"/>
+            </wp:cNvGraphicFramePr>
+            <a:graphic xmlns:a="http://schemas.openxmlformats.org/drawingml/2006/main">
+              <a:graphicData uri="http://schemas.openxmlformats.org/drawingml/2006/picture">
+                <pic:pic xmlns:pic="http://schemas.openxmlformats.org/drawingml/2006/picture">
+                  <pic:nvPicPr>
+                    <pic:cNvPr id="1736515702" name="Picture 5"/>
+                    <pic:cNvPicPr/>
+                  </pic:nvPicPr>
+                  <pic:blipFill>
+                    <a:blip r:embed="rId10">
+                      <a:extLst>
+                        <a:ext uri="{28A0092B-C50C-407E-A947-70E740481C1C}">
+                          <a14:useLocalDpi xmlns:a14="http://schemas.microsoft.com/office/drawing/2010/main" val="0"/>
+                        </a:ext>
+                      </a:extLst>
+                    </a:blip>
+                    <a:stretch>
+                      <a:fillRect/>
+                    </a:stretch>
+                  </pic:blipFill>
+                  <pic:spPr>
+                    <a:xfrm>
+                      <a:off x="0" y="0"/>
+                      <a:ext cx="236220" cy="236220"/>
+                    </a:xfrm>
+                    <a:prstGeom prst="rect">
+                      <a:avLst/>
+                    </a:prstGeom>
+                  </pic:spPr>
+                </pic:pic>
+              </a:graphicData>
+            </a:graphic>
+            <wp14:sizeRelH relativeFrom="page">
+              <wp14:pctWidth>0</wp14:pctWidth>
+            </wp14:sizeRelH>
+            <wp14:sizeRelV relativeFrom="page">
+              <wp14:pctHeight>0</wp14:pctHeight>
+            </wp14:sizeRelV>
+          </wp:anchor>
+        </w:drawing>
+      </w:r>
       <w:r>
         <w:rPr>
           <w:b/>
@@ -204,7 +368,7 @@
         <mc:AlternateContent>
           <mc:Choice Requires="wps">
             <w:drawing>
-              <wp:anchor distT="0" distB="0" distL="114300" distR="114300" simplePos="0" relativeHeight="251669504" behindDoc="0" locked="0" layoutInCell="1" allowOverlap="1" wp14:anchorId="793C92C9" wp14:editId="0B1B6702">
+              <wp:anchor distT="0" distB="0" distL="114300" distR="114300" simplePos="0" relativeHeight="251669504" behindDoc="0" locked="0" layoutInCell="1" allowOverlap="1" wp14:anchorId="793C92C9" wp14:editId="072CA4F6">
                 <wp:simplePos x="0" y="0"/>
                 <wp:positionH relativeFrom="margin">
                   <wp:posOffset>0</wp:posOffset>
@@ -272,7 +436,7 @@
           </mc:Choice>
           <mc:Fallback>
             <w:pict>
-              <v:rect w14:anchorId="4857EBDE" id="Retângulo 3" o:spid="_x0000_s1026" style="position:absolute;margin-left:0;margin-top:2.4pt;width:476.2pt;height:4.25pt;z-index:251669504;visibility:visible;mso-wrap-style:square;mso-width-percent:0;mso-height-percent:0;mso-wrap-distance-left:9pt;mso-wrap-distance-top:0;mso-wrap-distance-right:9pt;mso-wrap-distance-bottom:0;mso-position-horizontal:absolute;mso-position-horizontal-relative:margin;mso-position-vertical:absolute;mso-position-vertical-relative:text;mso-width-percent:0;mso-height-percent:0;mso-width-relative:margin;mso-height-relative:margin;v-text-anchor:middle" o:gfxdata="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" fillcolor="#ff7d01" stroked="f" strokeweight="1pt">
+              <v:rect w14:anchorId="40358BDC" id="Retângulo 3" o:spid="_x0000_s1026" style="position:absolute;margin-left:0;margin-top:2.4pt;width:476.2pt;height:4.25pt;z-index:251669504;visibility:visible;mso-wrap-style:square;mso-width-percent:0;mso-height-percent:0;mso-wrap-distance-left:9pt;mso-wrap-distance-top:0;mso-wrap-distance-right:9pt;mso-wrap-distance-bottom:0;mso-position-horizontal:absolute;mso-position-horizontal-relative:margin;mso-position-vertical:absolute;mso-position-vertical-relative:text;mso-width-percent:0;mso-height-percent:0;mso-width-relative:margin;mso-height-relative:margin;v-text-anchor:middle" o:gfxdata="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" fillcolor="#ff7d01" stroked="f" strokeweight="1pt">
                 <w10:wrap anchorx="margin"/>
               </v:rect>
             </w:pict>
@@ -340,8 +504,6 @@
             <w:pPr>
               <w:pStyle w:val="NoSpacing"/>
               <w:rPr>
-                <w:b w:val="0"/>
-                <w:bCs w:val="0"/>
                 <w:color w:val="0E2841" w:themeColor="text2"/>
                 <w:sz w:val="28"/>
                 <w:szCs w:val="28"/>
@@ -520,7 +682,7 @@
               </wp:anchor>
             </w:drawing>
           </mc:Choice>
-          <mc:Fallback>
+          <mc:Fallback xmlns:w16cei="http://schemas.microsoft.com/office/word/2026/wordml/cei">
             <w:pict>
               <v:rect w14:anchorId="70E2B630" id="Retângulo 5" o:spid="_x0000_s1026" style="position:absolute;margin-left:0;margin-top:.25pt;width:473.35pt;height:1.4pt;z-index:251665408;visibility:visible;mso-wrap-style:square;mso-width-percent:0;mso-height-percent:0;mso-wrap-distance-left:9pt;mso-wrap-distance-top:0;mso-wrap-distance-right:9pt;mso-wrap-distance-bottom:0;mso-position-horizontal:absolute;mso-position-horizontal-relative:margin;mso-position-vertical:absolute;mso-position-vertical-relative:text;mso-width-percent:0;mso-height-percent:0;mso-width-relative:margin;mso-height-relative:margin;v-text-anchor:middle" o:gfxdata="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" fillcolor="gray [1629]" stroked="f" strokeweight="1pt">
                 <w10:wrap anchorx="margin"/>
@@ -745,9 +907,9 @@
                 <w:szCs w:val="28"/>
               </w:rPr>
               <w:drawing>
-                <wp:inline distT="0" distB="0" distL="0" distR="0" wp14:anchorId="1A2DFBE4" wp14:editId="477F449C">
-                  <wp:extent cx="220133" cy="220133"/>
-                  <wp:effectExtent l="0" t="0" r="8890" b="8890"/>
+                <wp:inline distT="0" distB="0" distL="0" distR="0" wp14:anchorId="1A2DFBE4" wp14:editId="4E3BB4AD">
+                  <wp:extent cx="223674" cy="223674"/>
+                  <wp:effectExtent l="0" t="0" r="5080" b="5080"/>
                   <wp:docPr id="1955419859" name="Picture 11"/>
                   <wp:cNvGraphicFramePr>
                     <a:graphicFrameLocks xmlns:a="http://schemas.openxmlformats.org/drawingml/2006/main" noChangeAspect="1"/>
@@ -756,11 +918,11 @@
                     <a:graphicData uri="http://schemas.openxmlformats.org/drawingml/2006/picture">
                       <pic:pic xmlns:pic="http://schemas.openxmlformats.org/drawingml/2006/picture">
                         <pic:nvPicPr>
-                          <pic:cNvPr id="1955419859" name="Picture 1955419859"/>
+                          <pic:cNvPr id="1955419859" name="Picture 11"/>
                           <pic:cNvPicPr/>
                         </pic:nvPicPr>
                         <pic:blipFill>
-                          <a:blip r:embed="rId9" cstate="print">
+                          <a:blip r:embed="rId11">
                             <a:extLst>
                               <a:ext uri="{28A0092B-C50C-407E-A947-70E740481C1C}">
                                 <a14:useLocalDpi xmlns:a14="http://schemas.microsoft.com/office/drawing/2010/main" val="0"/>
@@ -833,26 +995,14 @@
               <w:pStyle w:val="NoSpacing"/>
               <w:cnfStyle w:val="100000000000" w:firstRow="1" w:lastRow="0" w:firstColumn="0" w:lastColumn="0" w:oddVBand="0" w:evenVBand="0" w:oddHBand="0" w:evenHBand="0" w:firstRowFirstColumn="0" w:firstRowLastColumn="0" w:lastRowFirstColumn="0" w:lastRowLastColumn="0"/>
               <w:rPr>
-                <w:b w:val="0"/>
-                <w:bCs w:val="0"/>
                 <w:color w:val="0E2841" w:themeColor="text2"/>
               </w:rPr>
             </w:pPr>
             <w:r>
               <w:rPr>
-                <w:b w:val="0"/>
-                <w:bCs w:val="0"/>
-                <w:color w:val="182737"/>
-              </w:rPr>
-              <w:t>Analista de Lorem</w:t>
-            </w:r>
-            <w:r>
-              <w:rPr>
-                <w:b w:val="0"/>
-                <w:bCs w:val="0"/>
-                <w:color w:val="182737"/>
-              </w:rPr>
-              <w:t xml:space="preserve"> Ipsum</w:t>
+                <w:color w:val="182737"/>
+              </w:rPr>
+              <w:t>Analista de Lorem Ipsum</w:t>
             </w:r>
           </w:p>
         </w:tc>
@@ -942,7 +1092,7 @@
               </wp:anchor>
             </w:drawing>
           </mc:Choice>
-          <mc:Fallback>
+          <mc:Fallback xmlns:w16cei="http://schemas.microsoft.com/office/word/2026/wordml/cei">
             <w:pict>
               <v:rect w14:anchorId="199045B3" id="Retângulo 5" o:spid="_x0000_s1026" style="position:absolute;margin-left:-.1pt;margin-top:4.85pt;width:473.35pt;height:1.4pt;z-index:251661312;visibility:visible;mso-wrap-style:square;mso-width-percent:0;mso-height-percent:0;mso-wrap-distance-left:9pt;mso-wrap-distance-top:0;mso-wrap-distance-right:9pt;mso-wrap-distance-bottom:0;mso-position-horizontal:absolute;mso-position-horizontal-relative:margin;mso-position-vertical:absolute;mso-position-vertical-relative:text;mso-width-percent:0;mso-height-percent:0;mso-width-relative:margin;mso-height-relative:margin;v-text-anchor:middle" o:gfxdata="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" fillcolor="gray [1629]" stroked="f" strokeweight="1pt">
                 <w10:wrap anchorx="margin"/>
@@ -987,7 +1137,69 @@
                 <w:lang w:val="en-US"/>
               </w:rPr>
               <w:drawing>
-                <wp:anchor distT="0" distB="0" distL="114300" distR="114300" simplePos="0" relativeHeight="251676672" behindDoc="0" locked="0" layoutInCell="1" allowOverlap="1" wp14:anchorId="18AEBD49" wp14:editId="4BA43429">
+                <wp:anchor distT="0" distB="0" distL="114300" distR="114300" simplePos="0" relativeHeight="251682816" behindDoc="0" locked="0" layoutInCell="1" allowOverlap="1" wp14:anchorId="178A3EC5" wp14:editId="17ED5B37">
+                  <wp:simplePos x="0" y="0"/>
+                  <wp:positionH relativeFrom="column">
+                    <wp:posOffset>0</wp:posOffset>
+                  </wp:positionH>
+                  <wp:positionV relativeFrom="paragraph">
+                    <wp:posOffset>0</wp:posOffset>
+                  </wp:positionV>
+                  <wp:extent cx="216000" cy="216000"/>
+                  <wp:effectExtent l="0" t="0" r="0" b="0"/>
+                  <wp:wrapSquare wrapText="bothSides"/>
+                  <wp:docPr id="1973426697" name="Picture 11"/>
+                  <wp:cNvGraphicFramePr>
+                    <a:graphicFrameLocks xmlns:a="http://schemas.openxmlformats.org/drawingml/2006/main" noChangeAspect="1"/>
+                  </wp:cNvGraphicFramePr>
+                  <a:graphic xmlns:a="http://schemas.openxmlformats.org/drawingml/2006/main">
+                    <a:graphicData uri="http://schemas.openxmlformats.org/drawingml/2006/picture">
+                      <pic:pic xmlns:pic="http://schemas.openxmlformats.org/drawingml/2006/picture">
+                        <pic:nvPicPr>
+                          <pic:cNvPr id="1973426697" name="Picture 11"/>
+                          <pic:cNvPicPr/>
+                        </pic:nvPicPr>
+                        <pic:blipFill>
+                          <a:blip r:embed="rId12">
+                            <a:extLst>
+                              <a:ext uri="{28A0092B-C50C-407E-A947-70E740481C1C}">
+                                <a14:useLocalDpi xmlns:a14="http://schemas.microsoft.com/office/drawing/2010/main" val="0"/>
+                              </a:ext>
+                            </a:extLst>
+                          </a:blip>
+                          <a:stretch>
+                            <a:fillRect/>
+                          </a:stretch>
+                        </pic:blipFill>
+                        <pic:spPr>
+                          <a:xfrm>
+                            <a:off x="0" y="0"/>
+                            <a:ext cx="216000" cy="216000"/>
+                          </a:xfrm>
+                          <a:prstGeom prst="rect">
+                            <a:avLst/>
+                          </a:prstGeom>
+                        </pic:spPr>
+                      </pic:pic>
+                    </a:graphicData>
+                  </a:graphic>
+                  <wp14:sizeRelH relativeFrom="page">
+                    <wp14:pctWidth>0</wp14:pctWidth>
+                  </wp14:sizeRelH>
+                  <wp14:sizeRelV relativeFrom="page">
+                    <wp14:pctHeight>0</wp14:pctHeight>
+                  </wp14:sizeRelV>
+                </wp:anchor>
+              </w:drawing>
+            </w:r>
+            <w:r>
+              <w:rPr>
+                <w:noProof/>
+                <w:color w:val="0E2841" w:themeColor="text2"/>
+                <w:lang w:val="en-US"/>
+              </w:rPr>
+              <w:drawing>
+                <wp:anchor distT="0" distB="0" distL="114300" distR="114300" simplePos="0" relativeHeight="251676672" behindDoc="0" locked="0" layoutInCell="1" allowOverlap="1" wp14:anchorId="18AEBD49" wp14:editId="5E6F6DFF">
                   <wp:simplePos x="0" y="0"/>
                   <wp:positionH relativeFrom="column">
                     <wp:posOffset>5424170</wp:posOffset>
@@ -1010,10 +1222,10 @@
                           <pic:cNvPicPr/>
                         </pic:nvPicPr>
                         <pic:blipFill>
-                          <a:blip r:embed="rId10">
+                          <a:blip r:embed="rId13">
                             <a:extLst>
                               <a:ext uri="{96DAC541-7B7A-43D3-8B79-37D633B846F1}">
-                                <asvg:svgBlip xmlns:asvg="http://schemas.microsoft.com/office/drawing/2016/SVG/main" r:embed="rId11"/>
+                                <asvg:svgBlip xmlns:asvg="http://schemas.microsoft.com/office/drawing/2016/SVG/main" r:embed="rId14"/>
                               </a:ext>
                             </a:extLst>
                           </a:blip>
@@ -1768,6 +1980,68 @@
                 <w:lang w:val="en-US"/>
               </w:rPr>
               <w:drawing>
+                <wp:anchor distT="0" distB="0" distL="114300" distR="114300" simplePos="0" relativeHeight="251680768" behindDoc="0" locked="0" layoutInCell="1" allowOverlap="1" wp14:anchorId="1B189E10" wp14:editId="7408FD61">
+                  <wp:simplePos x="0" y="0"/>
+                  <wp:positionH relativeFrom="column">
+                    <wp:posOffset>0</wp:posOffset>
+                  </wp:positionH>
+                  <wp:positionV relativeFrom="paragraph">
+                    <wp:posOffset>635</wp:posOffset>
+                  </wp:positionV>
+                  <wp:extent cx="216000" cy="216000"/>
+                  <wp:effectExtent l="0" t="0" r="0" b="0"/>
+                  <wp:wrapSquare wrapText="bothSides"/>
+                  <wp:docPr id="2143824876" name="Picture 8"/>
+                  <wp:cNvGraphicFramePr>
+                    <a:graphicFrameLocks xmlns:a="http://schemas.openxmlformats.org/drawingml/2006/main" noChangeAspect="1"/>
+                  </wp:cNvGraphicFramePr>
+                  <a:graphic xmlns:a="http://schemas.openxmlformats.org/drawingml/2006/main">
+                    <a:graphicData uri="http://schemas.openxmlformats.org/drawingml/2006/picture">
+                      <pic:pic xmlns:pic="http://schemas.openxmlformats.org/drawingml/2006/picture">
+                        <pic:nvPicPr>
+                          <pic:cNvPr id="2143824876" name="Picture 8"/>
+                          <pic:cNvPicPr/>
+                        </pic:nvPicPr>
+                        <pic:blipFill>
+                          <a:blip r:embed="rId15">
+                            <a:extLst>
+                              <a:ext uri="{28A0092B-C50C-407E-A947-70E740481C1C}">
+                                <a14:useLocalDpi xmlns:a14="http://schemas.microsoft.com/office/drawing/2010/main" val="0"/>
+                              </a:ext>
+                            </a:extLst>
+                          </a:blip>
+                          <a:stretch>
+                            <a:fillRect/>
+                          </a:stretch>
+                        </pic:blipFill>
+                        <pic:spPr>
+                          <a:xfrm>
+                            <a:off x="0" y="0"/>
+                            <a:ext cx="216000" cy="216000"/>
+                          </a:xfrm>
+                          <a:prstGeom prst="rect">
+                            <a:avLst/>
+                          </a:prstGeom>
+                        </pic:spPr>
+                      </pic:pic>
+                    </a:graphicData>
+                  </a:graphic>
+                  <wp14:sizeRelH relativeFrom="page">
+                    <wp14:pctWidth>0</wp14:pctWidth>
+                  </wp14:sizeRelH>
+                  <wp14:sizeRelV relativeFrom="page">
+                    <wp14:pctHeight>0</wp14:pctHeight>
+                  </wp14:sizeRelV>
+                </wp:anchor>
+              </w:drawing>
+            </w:r>
+            <w:r>
+              <w:rPr>
+                <w:noProof/>
+                <w:color w:val="0E2841" w:themeColor="text2"/>
+                <w:lang w:val="en-US"/>
+              </w:rPr>
+              <w:drawing>
                 <wp:anchor distT="0" distB="0" distL="114300" distR="114300" simplePos="0" relativeHeight="251670528" behindDoc="0" locked="0" layoutInCell="1" allowOverlap="1" wp14:anchorId="3EFB253A" wp14:editId="49CDFBD8">
                   <wp:simplePos x="0" y="0"/>
                   <wp:positionH relativeFrom="column">
@@ -1791,10 +2065,10 @@
                           <pic:cNvPicPr/>
                         </pic:nvPicPr>
                         <pic:blipFill>
-                          <a:blip r:embed="rId10">
+                          <a:blip r:embed="rId13">
                             <a:extLst>
                               <a:ext uri="{96DAC541-7B7A-43D3-8B79-37D633B846F1}">
-                                <asvg:svgBlip xmlns:asvg="http://schemas.microsoft.com/office/drawing/2016/SVG/main" r:embed="rId11"/>
+                                <asvg:svgBlip xmlns:asvg="http://schemas.microsoft.com/office/drawing/2016/SVG/main" r:embed="rId14"/>
                               </a:ext>
                             </a:extLst>
                           </a:blip>
@@ -2266,54 +2540,6 @@
               <w:rPr>
                 <w:color w:val="182737"/>
               </w:rPr>
-              <w:t>Contas a Pagar</w:t>
-            </w:r>
-          </w:p>
-        </w:tc>
-        <w:tc>
-          <w:tcPr>
-            <w:tcW w:w="6663" w:type="dxa"/>
-          </w:tcPr>
-          <w:p>
-            <w:pPr>
-              <w:pStyle w:val="NoSpacing"/>
-              <w:numPr>
-                <w:ilvl w:val="0"/>
-                <w:numId w:val="5"/>
-              </w:numPr>
-              <w:rPr>
-                <w:color w:val="182737"/>
-              </w:rPr>
-            </w:pPr>
-            <w:r>
-              <w:rPr>
-                <w:color w:val="182737"/>
-              </w:rPr>
-              <w:t>Assistente Financeiro</w:t>
-            </w:r>
-          </w:p>
-        </w:tc>
-      </w:tr>
-      <w:tr>
-        <w:tc>
-          <w:tcPr>
-            <w:tcW w:w="2830" w:type="dxa"/>
-          </w:tcPr>
-          <w:p>
-            <w:pPr>
-              <w:pStyle w:val="NoSpacing"/>
-              <w:numPr>
-                <w:ilvl w:val="0"/>
-                <w:numId w:val="3"/>
-              </w:numPr>
-              <w:rPr>
-                <w:color w:val="182737"/>
-              </w:rPr>
-            </w:pPr>
-            <w:r>
-              <w:rPr>
-                <w:color w:val="182737"/>
-              </w:rPr>
               <w:t>Obra</w:t>
             </w:r>
           </w:p>
@@ -2387,7 +2613,7 @@
                 <w:lang w:val="en-US"/>
               </w:rPr>
               <w:drawing>
-                <wp:anchor distT="0" distB="0" distL="114300" distR="114300" simplePos="0" relativeHeight="251672576" behindDoc="0" locked="0" layoutInCell="1" allowOverlap="1" wp14:anchorId="7B3D55A5" wp14:editId="2AE3CC9E">
+                <wp:anchor distT="0" distB="0" distL="114300" distR="114300" simplePos="0" relativeHeight="251672576" behindDoc="0" locked="0" layoutInCell="1" allowOverlap="1" wp14:anchorId="7B3D55A5" wp14:editId="058E0EFE">
                   <wp:simplePos x="0" y="0"/>
                   <wp:positionH relativeFrom="column">
                     <wp:posOffset>5404373</wp:posOffset>
@@ -2410,10 +2636,10 @@
                           <pic:cNvPicPr/>
                         </pic:nvPicPr>
                         <pic:blipFill>
-                          <a:blip r:embed="rId10">
+                          <a:blip r:embed="rId13">
                             <a:extLst>
                               <a:ext uri="{96DAC541-7B7A-43D3-8B79-37D633B846F1}">
-                                <asvg:svgBlip xmlns:asvg="http://schemas.microsoft.com/office/drawing/2016/SVG/main" r:embed="rId11"/>
+                                <asvg:svgBlip xmlns:asvg="http://schemas.microsoft.com/office/drawing/2016/SVG/main" r:embed="rId14"/>
                               </a:ext>
                             </a:extLst>
                           </a:blip>
@@ -2425,6 +2651,71 @@
                           <a:xfrm>
                             <a:off x="0" y="0"/>
                             <a:ext cx="501885" cy="281906"/>
+                          </a:xfrm>
+                          <a:prstGeom prst="rect">
+                            <a:avLst/>
+                          </a:prstGeom>
+                        </pic:spPr>
+                      </pic:pic>
+                    </a:graphicData>
+                  </a:graphic>
+                  <wp14:sizeRelH relativeFrom="page">
+                    <wp14:pctWidth>0</wp14:pctWidth>
+                  </wp14:sizeRelH>
+                  <wp14:sizeRelV relativeFrom="page">
+                    <wp14:pctHeight>0</wp14:pctHeight>
+                  </wp14:sizeRelV>
+                </wp:anchor>
+              </w:drawing>
+            </w:r>
+            <w:r>
+              <w:rPr>
+                <w:b/>
+                <w:bCs/>
+                <w:noProof/>
+                <w:color w:val="0E2841" w:themeColor="text2"/>
+                <w:sz w:val="32"/>
+                <w:szCs w:val="32"/>
+              </w:rPr>
+              <w:drawing>
+                <wp:anchor distT="0" distB="0" distL="114300" distR="114300" simplePos="0" relativeHeight="251681792" behindDoc="0" locked="0" layoutInCell="1" allowOverlap="1" wp14:anchorId="2076EA88" wp14:editId="0639D765">
+                  <wp:simplePos x="0" y="0"/>
+                  <wp:positionH relativeFrom="column">
+                    <wp:posOffset>0</wp:posOffset>
+                  </wp:positionH>
+                  <wp:positionV relativeFrom="paragraph">
+                    <wp:posOffset>635</wp:posOffset>
+                  </wp:positionV>
+                  <wp:extent cx="232410" cy="232410"/>
+                  <wp:effectExtent l="0" t="0" r="0" b="0"/>
+                  <wp:wrapSquare wrapText="bothSides"/>
+                  <wp:docPr id="1377445313" name="Picture 10"/>
+                  <wp:cNvGraphicFramePr>
+                    <a:graphicFrameLocks xmlns:a="http://schemas.openxmlformats.org/drawingml/2006/main" noChangeAspect="1"/>
+                  </wp:cNvGraphicFramePr>
+                  <a:graphic xmlns:a="http://schemas.openxmlformats.org/drawingml/2006/main">
+                    <a:graphicData uri="http://schemas.openxmlformats.org/drawingml/2006/picture">
+                      <pic:pic xmlns:pic="http://schemas.openxmlformats.org/drawingml/2006/picture">
+                        <pic:nvPicPr>
+                          <pic:cNvPr id="1377445313" name="Picture 10"/>
+                          <pic:cNvPicPr/>
+                        </pic:nvPicPr>
+                        <pic:blipFill>
+                          <a:blip r:embed="rId16">
+                            <a:extLst>
+                              <a:ext uri="{28A0092B-C50C-407E-A947-70E740481C1C}">
+                                <a14:useLocalDpi xmlns:a14="http://schemas.microsoft.com/office/drawing/2010/main" val="0"/>
+                              </a:ext>
+                            </a:extLst>
+                          </a:blip>
+                          <a:stretch>
+                            <a:fillRect/>
+                          </a:stretch>
+                        </pic:blipFill>
+                        <pic:spPr>
+                          <a:xfrm>
+                            <a:off x="0" y="0"/>
+                            <a:ext cx="232410" cy="232410"/>
                           </a:xfrm>
                           <a:prstGeom prst="rect">
                             <a:avLst/>
@@ -2616,6 +2907,68 @@
                 <w:lang w:val="en-US"/>
               </w:rPr>
               <w:drawing>
+                <wp:anchor distT="0" distB="0" distL="114300" distR="114300" simplePos="0" relativeHeight="251683840" behindDoc="0" locked="0" layoutInCell="1" allowOverlap="1" wp14:anchorId="6774B1A7" wp14:editId="39FB98CF">
+                  <wp:simplePos x="0" y="0"/>
+                  <wp:positionH relativeFrom="column">
+                    <wp:posOffset>544</wp:posOffset>
+                  </wp:positionH>
+                  <wp:positionV relativeFrom="paragraph">
+                    <wp:posOffset>1633</wp:posOffset>
+                  </wp:positionV>
+                  <wp:extent cx="216000" cy="216000"/>
+                  <wp:effectExtent l="0" t="0" r="0" b="0"/>
+                  <wp:wrapSquare wrapText="bothSides"/>
+                  <wp:docPr id="1369900796" name="Picture 14"/>
+                  <wp:cNvGraphicFramePr>
+                    <a:graphicFrameLocks xmlns:a="http://schemas.openxmlformats.org/drawingml/2006/main" noChangeAspect="1"/>
+                  </wp:cNvGraphicFramePr>
+                  <a:graphic xmlns:a="http://schemas.openxmlformats.org/drawingml/2006/main">
+                    <a:graphicData uri="http://schemas.openxmlformats.org/drawingml/2006/picture">
+                      <pic:pic xmlns:pic="http://schemas.openxmlformats.org/drawingml/2006/picture">
+                        <pic:nvPicPr>
+                          <pic:cNvPr id="1369900796" name="Picture 14"/>
+                          <pic:cNvPicPr/>
+                        </pic:nvPicPr>
+                        <pic:blipFill>
+                          <a:blip r:embed="rId17">
+                            <a:extLst>
+                              <a:ext uri="{28A0092B-C50C-407E-A947-70E740481C1C}">
+                                <a14:useLocalDpi xmlns:a14="http://schemas.microsoft.com/office/drawing/2010/main" val="0"/>
+                              </a:ext>
+                            </a:extLst>
+                          </a:blip>
+                          <a:stretch>
+                            <a:fillRect/>
+                          </a:stretch>
+                        </pic:blipFill>
+                        <pic:spPr>
+                          <a:xfrm>
+                            <a:off x="0" y="0"/>
+                            <a:ext cx="216000" cy="216000"/>
+                          </a:xfrm>
+                          <a:prstGeom prst="rect">
+                            <a:avLst/>
+                          </a:prstGeom>
+                        </pic:spPr>
+                      </pic:pic>
+                    </a:graphicData>
+                  </a:graphic>
+                  <wp14:sizeRelH relativeFrom="page">
+                    <wp14:pctWidth>0</wp14:pctWidth>
+                  </wp14:sizeRelH>
+                  <wp14:sizeRelV relativeFrom="page">
+                    <wp14:pctHeight>0</wp14:pctHeight>
+                  </wp14:sizeRelV>
+                </wp:anchor>
+              </w:drawing>
+            </w:r>
+            <w:r>
+              <w:rPr>
+                <w:noProof/>
+                <w:color w:val="0E2841" w:themeColor="text2"/>
+                <w:lang w:val="en-US"/>
+              </w:rPr>
+              <w:drawing>
                 <wp:anchor distT="0" distB="0" distL="114300" distR="114300" simplePos="0" relativeHeight="251674624" behindDoc="0" locked="0" layoutInCell="1" allowOverlap="1" wp14:anchorId="04EA60B0" wp14:editId="2EC30436">
                   <wp:simplePos x="0" y="0"/>
                   <wp:positionH relativeFrom="column">
@@ -2639,10 +2992,10 @@
                           <pic:cNvPicPr/>
                         </pic:nvPicPr>
                         <pic:blipFill>
-                          <a:blip r:embed="rId10">
+                          <a:blip r:embed="rId13">
                             <a:extLst>
                               <a:ext uri="{96DAC541-7B7A-43D3-8B79-37D633B846F1}">
-                                <asvg:svgBlip xmlns:asvg="http://schemas.microsoft.com/office/drawing/2016/SVG/main" r:embed="rId11"/>
+                                <asvg:svgBlip xmlns:asvg="http://schemas.microsoft.com/office/drawing/2016/SVG/main" r:embed="rId14"/>
                               </a:ext>
                             </a:extLst>
                           </a:blip>
@@ -2693,410 +3046,6 @@
         </w:rPr>
       </w:pPr>
     </w:p>
-    <w:tbl>
-      <w:tblPr>
-        <w:tblStyle w:val="PlainTable3"/>
-        <w:tblW w:w="0" w:type="auto"/>
-        <w:tblLook w:val="04A0" w:firstRow="1" w:lastRow="0" w:firstColumn="1" w:lastColumn="0" w:noHBand="0" w:noVBand="1"/>
-      </w:tblPr>
-      <w:tblGrid>
-        <w:gridCol w:w="4744"/>
-        <w:gridCol w:w="4744"/>
-      </w:tblGrid>
-      <w:tr>
-        <w:trPr>
-          <w:cnfStyle w:val="100000000000" w:firstRow="1" w:lastRow="0" w:firstColumn="0" w:lastColumn="0" w:oddVBand="0" w:evenVBand="0" w:oddHBand="0" w:evenHBand="0" w:firstRowFirstColumn="0" w:firstRowLastColumn="0" w:lastRowFirstColumn="0" w:lastRowLastColumn="0"/>
-        </w:trPr>
-        <w:tc>
-          <w:tcPr>
-            <w:cnfStyle w:val="001000000100" w:firstRow="0" w:lastRow="0" w:firstColumn="1" w:lastColumn="0" w:oddVBand="0" w:evenVBand="0" w:oddHBand="0" w:evenHBand="0" w:firstRowFirstColumn="1" w:firstRowLastColumn="0" w:lastRowFirstColumn="0" w:lastRowLastColumn="0"/>
-            <w:tcW w:w="4744" w:type="dxa"/>
-            <w:vAlign w:val="center"/>
-          </w:tcPr>
-          <w:p>
-            <w:pPr>
-              <w:pStyle w:val="NoSpacing"/>
-              <w:rPr>
-                <w:b w:val="0"/>
-                <w:bCs w:val="0"/>
-                <w:color w:val="182737"/>
-              </w:rPr>
-            </w:pPr>
-            <w:bookmarkStart w:id="1" w:name="_Hlk196409413"/>
-            <w:r>
-              <w:rPr>
-                <w:b w:val="0"/>
-                <w:bCs w:val="0"/>
-                <w:caps w:val="0"/>
-                <w:color w:val="182737"/>
-              </w:rPr>
-              <w:t xml:space="preserve">Nome </w:t>
-            </w:r>
-            <w:r>
-              <w:rPr>
-                <w:b w:val="0"/>
-                <w:bCs w:val="0"/>
-                <w:caps w:val="0"/>
-                <w:color w:val="182737"/>
-              </w:rPr>
-              <w:t>Procedimento #01</w:t>
-            </w:r>
-            <w:r>
-              <w:rPr>
-                <w:b w:val="0"/>
-                <w:bCs w:val="0"/>
-                <w:caps w:val="0"/>
-                <w:color w:val="182737"/>
-              </w:rPr>
-              <w:t>:</w:t>
-            </w:r>
-          </w:p>
-        </w:tc>
-        <w:tc>
-          <w:tcPr>
-            <w:tcW w:w="4744" w:type="dxa"/>
-          </w:tcPr>
-          <w:p>
-            <w:pPr>
-              <w:pStyle w:val="NoSpacing"/>
-              <w:numPr>
-                <w:ilvl w:val="0"/>
-                <w:numId w:val="2"/>
-              </w:numPr>
-              <w:cnfStyle w:val="100000000000" w:firstRow="1" w:lastRow="0" w:firstColumn="0" w:lastColumn="0" w:oddVBand="0" w:evenVBand="0" w:oddHBand="0" w:evenHBand="0" w:firstRowFirstColumn="0" w:firstRowLastColumn="0" w:lastRowFirstColumn="0" w:lastRowLastColumn="0"/>
-              <w:rPr>
-                <w:b w:val="0"/>
-                <w:bCs w:val="0"/>
-                <w:color w:val="182737"/>
-              </w:rPr>
-            </w:pPr>
-            <w:r>
-              <w:rPr>
-                <w:b w:val="0"/>
-                <w:bCs w:val="0"/>
-                <w:caps w:val="0"/>
-                <w:color w:val="182737"/>
-                <w:lang w:val="en-US"/>
-              </w:rPr>
-              <w:t xml:space="preserve">Lorem ipsum dolor </w:t>
-            </w:r>
-            <w:proofErr w:type="gramStart"/>
-            <w:r>
-              <w:rPr>
-                <w:b w:val="0"/>
-                <w:bCs w:val="0"/>
-                <w:caps w:val="0"/>
-                <w:color w:val="182737"/>
-                <w:lang w:val="en-US"/>
-              </w:rPr>
-              <w:t>sit</w:t>
-            </w:r>
-            <w:proofErr w:type="gramEnd"/>
-            <w:r>
-              <w:rPr>
-                <w:b w:val="0"/>
-                <w:bCs w:val="0"/>
-                <w:caps w:val="0"/>
-                <w:color w:val="182737"/>
-                <w:lang w:val="en-US"/>
-              </w:rPr>
-              <w:t xml:space="preserve"> </w:t>
-            </w:r>
-            <w:proofErr w:type="spellStart"/>
-            <w:r>
-              <w:rPr>
-                <w:b w:val="0"/>
-                <w:bCs w:val="0"/>
-                <w:caps w:val="0"/>
-                <w:color w:val="182737"/>
-                <w:lang w:val="en-US"/>
-              </w:rPr>
-              <w:t>amet</w:t>
-            </w:r>
-            <w:proofErr w:type="spellEnd"/>
-            <w:r>
-              <w:rPr>
-                <w:b w:val="0"/>
-                <w:bCs w:val="0"/>
-                <w:caps w:val="0"/>
-                <w:color w:val="182737"/>
-                <w:lang w:val="en-US"/>
-              </w:rPr>
-              <w:t xml:space="preserve"> in </w:t>
-            </w:r>
-            <w:proofErr w:type="spellStart"/>
-            <w:r>
-              <w:rPr>
-                <w:b w:val="0"/>
-                <w:bCs w:val="0"/>
-                <w:caps w:val="0"/>
-                <w:color w:val="182737"/>
-                <w:lang w:val="en-US"/>
-              </w:rPr>
-              <w:t>commodo</w:t>
-            </w:r>
-            <w:proofErr w:type="spellEnd"/>
-            <w:r>
-              <w:rPr>
-                <w:b w:val="0"/>
-                <w:bCs w:val="0"/>
-                <w:caps w:val="0"/>
-                <w:color w:val="182737"/>
-                <w:lang w:val="en-US"/>
-              </w:rPr>
-              <w:t xml:space="preserve">. Ut </w:t>
-            </w:r>
-            <w:proofErr w:type="spellStart"/>
-            <w:r>
-              <w:rPr>
-                <w:b w:val="0"/>
-                <w:bCs w:val="0"/>
-                <w:caps w:val="0"/>
-                <w:color w:val="182737"/>
-                <w:lang w:val="en-US"/>
-              </w:rPr>
-              <w:t>commodo</w:t>
-            </w:r>
-            <w:proofErr w:type="spellEnd"/>
-            <w:r>
-              <w:rPr>
-                <w:b w:val="0"/>
-                <w:bCs w:val="0"/>
-                <w:caps w:val="0"/>
-                <w:color w:val="182737"/>
-                <w:lang w:val="en-US"/>
-              </w:rPr>
-              <w:t xml:space="preserve"> labore dolor </w:t>
-            </w:r>
-            <w:proofErr w:type="spellStart"/>
-            <w:r>
-              <w:rPr>
-                <w:b w:val="0"/>
-                <w:bCs w:val="0"/>
-                <w:caps w:val="0"/>
-                <w:color w:val="182737"/>
-                <w:lang w:val="en-US"/>
-              </w:rPr>
-              <w:t>deserunt</w:t>
-            </w:r>
-            <w:proofErr w:type="spellEnd"/>
-            <w:r>
-              <w:rPr>
-                <w:b w:val="0"/>
-                <w:bCs w:val="0"/>
-                <w:caps w:val="0"/>
-                <w:color w:val="182737"/>
-                <w:lang w:val="en-US"/>
-              </w:rPr>
-              <w:t xml:space="preserve"> </w:t>
-            </w:r>
-            <w:proofErr w:type="spellStart"/>
-            <w:r>
-              <w:rPr>
-                <w:b w:val="0"/>
-                <w:bCs w:val="0"/>
-                <w:caps w:val="0"/>
-                <w:color w:val="182737"/>
-                <w:lang w:val="en-US"/>
-              </w:rPr>
-              <w:t>voluptate</w:t>
-            </w:r>
-            <w:proofErr w:type="spellEnd"/>
-            <w:r>
-              <w:rPr>
-                <w:b w:val="0"/>
-                <w:bCs w:val="0"/>
-                <w:caps w:val="0"/>
-                <w:color w:val="182737"/>
-                <w:lang w:val="en-US"/>
-              </w:rPr>
-              <w:t xml:space="preserve"> non. </w:t>
-            </w:r>
-            <w:proofErr w:type="spellStart"/>
-            <w:r>
-              <w:rPr>
-                <w:b w:val="0"/>
-                <w:bCs w:val="0"/>
-                <w:caps w:val="0"/>
-                <w:color w:val="182737"/>
-              </w:rPr>
-              <w:t>Consequat</w:t>
-            </w:r>
-            <w:proofErr w:type="spellEnd"/>
-            <w:r>
-              <w:rPr>
-                <w:b w:val="0"/>
-                <w:bCs w:val="0"/>
-                <w:caps w:val="0"/>
-                <w:color w:val="182737"/>
-              </w:rPr>
-              <w:t xml:space="preserve"> </w:t>
-            </w:r>
-            <w:proofErr w:type="spellStart"/>
-            <w:r>
-              <w:rPr>
-                <w:b w:val="0"/>
-                <w:bCs w:val="0"/>
-                <w:caps w:val="0"/>
-                <w:color w:val="182737"/>
-              </w:rPr>
-              <w:t>pariatur</w:t>
-            </w:r>
-            <w:proofErr w:type="spellEnd"/>
-            <w:r>
-              <w:rPr>
-                <w:b w:val="0"/>
-                <w:bCs w:val="0"/>
-                <w:caps w:val="0"/>
-                <w:color w:val="182737"/>
-              </w:rPr>
-              <w:t xml:space="preserve"> </w:t>
-            </w:r>
-            <w:proofErr w:type="spellStart"/>
-            <w:r>
-              <w:rPr>
-                <w:b w:val="0"/>
-                <w:bCs w:val="0"/>
-                <w:caps w:val="0"/>
-                <w:color w:val="182737"/>
-              </w:rPr>
-              <w:t>lorem</w:t>
-            </w:r>
-            <w:proofErr w:type="spellEnd"/>
-            <w:r>
-              <w:rPr>
-                <w:b w:val="0"/>
-                <w:bCs w:val="0"/>
-                <w:caps w:val="0"/>
-                <w:color w:val="182737"/>
-              </w:rPr>
-              <w:t xml:space="preserve"> non </w:t>
-            </w:r>
-            <w:proofErr w:type="spellStart"/>
-            <w:r>
-              <w:rPr>
-                <w:b w:val="0"/>
-                <w:bCs w:val="0"/>
-                <w:caps w:val="0"/>
-                <w:color w:val="182737"/>
-              </w:rPr>
-              <w:t>adipiscing</w:t>
-            </w:r>
-            <w:proofErr w:type="spellEnd"/>
-            <w:r>
-              <w:rPr>
-                <w:b w:val="0"/>
-                <w:bCs w:val="0"/>
-                <w:caps w:val="0"/>
-                <w:color w:val="182737"/>
-              </w:rPr>
-              <w:t xml:space="preserve"> </w:t>
-            </w:r>
-            <w:proofErr w:type="spellStart"/>
-            <w:r>
-              <w:rPr>
-                <w:b w:val="0"/>
-                <w:bCs w:val="0"/>
-                <w:caps w:val="0"/>
-                <w:color w:val="182737"/>
-              </w:rPr>
-              <w:t>veniam</w:t>
-            </w:r>
-            <w:proofErr w:type="spellEnd"/>
-            <w:r>
-              <w:rPr>
-                <w:b w:val="0"/>
-                <w:bCs w:val="0"/>
-                <w:caps w:val="0"/>
-                <w:color w:val="182737"/>
-              </w:rPr>
-              <w:t xml:space="preserve"> </w:t>
-            </w:r>
-            <w:proofErr w:type="spellStart"/>
-            <w:r>
-              <w:rPr>
-                <w:b w:val="0"/>
-                <w:bCs w:val="0"/>
-                <w:caps w:val="0"/>
-                <w:color w:val="182737"/>
-              </w:rPr>
-              <w:t>dolor</w:t>
-            </w:r>
-            <w:proofErr w:type="spellEnd"/>
-            <w:r>
-              <w:rPr>
-                <w:b w:val="0"/>
-                <w:bCs w:val="0"/>
-                <w:caps w:val="0"/>
-                <w:color w:val="182737"/>
-              </w:rPr>
-              <w:t xml:space="preserve"> </w:t>
-            </w:r>
-            <w:proofErr w:type="spellStart"/>
-            <w:r>
-              <w:rPr>
-                <w:b w:val="0"/>
-                <w:bCs w:val="0"/>
-                <w:caps w:val="0"/>
-                <w:color w:val="182737"/>
-              </w:rPr>
-              <w:t>laborum</w:t>
-            </w:r>
-            <w:proofErr w:type="spellEnd"/>
-            <w:r>
-              <w:rPr>
-                <w:b w:val="0"/>
-                <w:bCs w:val="0"/>
-                <w:caps w:val="0"/>
-                <w:color w:val="182737"/>
-              </w:rPr>
-              <w:t xml:space="preserve"> </w:t>
-            </w:r>
-            <w:proofErr w:type="spellStart"/>
-            <w:r>
-              <w:rPr>
-                <w:b w:val="0"/>
-                <w:bCs w:val="0"/>
-                <w:caps w:val="0"/>
-                <w:color w:val="182737"/>
-              </w:rPr>
-              <w:t>cillum</w:t>
-            </w:r>
-            <w:proofErr w:type="spellEnd"/>
-            <w:r>
-              <w:rPr>
-                <w:b w:val="0"/>
-                <w:bCs w:val="0"/>
-                <w:caps w:val="0"/>
-                <w:color w:val="182737"/>
-              </w:rPr>
-              <w:t xml:space="preserve"> </w:t>
-            </w:r>
-            <w:proofErr w:type="spellStart"/>
-            <w:r>
-              <w:rPr>
-                <w:b w:val="0"/>
-                <w:bCs w:val="0"/>
-                <w:caps w:val="0"/>
-                <w:color w:val="182737"/>
-              </w:rPr>
-              <w:t>dolore</w:t>
-            </w:r>
-            <w:proofErr w:type="spellEnd"/>
-            <w:r>
-              <w:rPr>
-                <w:b w:val="0"/>
-                <w:bCs w:val="0"/>
-                <w:caps w:val="0"/>
-                <w:color w:val="182737"/>
-              </w:rPr>
-              <w:t>.</w:t>
-            </w:r>
-          </w:p>
-        </w:tc>
-      </w:tr>
-      <w:bookmarkEnd w:id="1"/>
-    </w:tbl>
     <w:p>
       <w:pPr>
         <w:pStyle w:val="NoSpacing"/>
@@ -3105,394 +3054,198 @@
         </w:rPr>
       </w:pPr>
     </w:p>
+    <w:p>
+      <w:pPr>
+        <w:keepNext/>
+        <w:spacing w:before="120" w:after="0"/>
+        <w:jc w:val="center"/>
+      </w:pPr>
+      <w:r>
+        <w:rPr>
+          <w:noProof/>
+        </w:rPr>
+        <w:drawing>
+          <wp:inline distT="0" distB="0" distL="0" distR="0" wp14:anchorId="18ACC49A" wp14:editId="431A0039">
+            <wp:extent cx="5649685" cy="4582599"/>
+            <wp:effectExtent l="0" t="0" r="8255" b="0"/>
+            <wp:docPr id="2112189558" name="Picture 15"/>
+            <wp:cNvGraphicFramePr>
+              <a:graphicFrameLocks xmlns:a="http://schemas.openxmlformats.org/drawingml/2006/main" noChangeAspect="1"/>
+            </wp:cNvGraphicFramePr>
+            <a:graphic xmlns:a="http://schemas.openxmlformats.org/drawingml/2006/main">
+              <a:graphicData uri="http://schemas.openxmlformats.org/drawingml/2006/picture">
+                <pic:pic xmlns:pic="http://schemas.openxmlformats.org/drawingml/2006/picture">
+                  <pic:nvPicPr>
+                    <pic:cNvPr id="0" name="Picture 1"/>
+                    <pic:cNvPicPr>
+                      <a:picLocks noChangeAspect="1" noChangeArrowheads="1"/>
+                    </pic:cNvPicPr>
+                  </pic:nvPicPr>
+                  <pic:blipFill rotWithShape="1">
+                    <a:blip r:embed="rId18">
+                      <a:extLst>
+                        <a:ext uri="{28A0092B-C50C-407E-A947-70E740481C1C}">
+                          <a14:useLocalDpi xmlns:a14="http://schemas.microsoft.com/office/drawing/2010/main" val="0"/>
+                        </a:ext>
+                      </a:extLst>
+                    </a:blip>
+                    <a:srcRect l="3249" t="4687" r="3063" b="9509"/>
+                    <a:stretch>
+                      <a:fillRect/>
+                    </a:stretch>
+                  </pic:blipFill>
+                  <pic:spPr bwMode="auto">
+                    <a:xfrm>
+                      <a:off x="0" y="0"/>
+                      <a:ext cx="5650543" cy="4583295"/>
+                    </a:xfrm>
+                    <a:prstGeom prst="rect">
+                      <a:avLst/>
+                    </a:prstGeom>
+                    <a:noFill/>
+                    <a:ln>
+                      <a:noFill/>
+                    </a:ln>
+                    <a:extLst>
+                      <a:ext uri="{53640926-AAD7-44D8-BBD7-CCE9431645EC}">
+                        <a14:shadowObscured xmlns:a14="http://schemas.microsoft.com/office/drawing/2010/main"/>
+                      </a:ext>
+                    </a:extLst>
+                  </pic:spPr>
+                </pic:pic>
+              </a:graphicData>
+            </a:graphic>
+          </wp:inline>
+        </w:drawing>
+      </w:r>
+      <w:r>
+        <w:rPr>
+          <w:noProof/>
+        </w:rPr>
+        <w:t xml:space="preserve"> </w:t>
+      </w:r>
+    </w:p>
+    <w:p>
+      <w:pPr>
+        <w:keepNext/>
+        <w:spacing w:before="120" w:after="0"/>
+        <w:jc w:val="center"/>
+        <w:rPr>
+          <w:sz w:val="14"/>
+          <w:szCs w:val="14"/>
+        </w:rPr>
+      </w:pPr>
+    </w:p>
     <w:tbl>
       <w:tblPr>
-        <w:tblStyle w:val="PlainTable3"/>
-        <w:tblW w:w="0" w:type="auto"/>
-        <w:tblLook w:val="04A0" w:firstRow="1" w:lastRow="0" w:firstColumn="1" w:lastColumn="0" w:noHBand="0" w:noVBand="1"/>
+        <w:tblW w:w="9449" w:type="dxa"/>
+        <w:jc w:val="center"/>
+        <w:tblBorders>
+          <w:top w:val="single" w:sz="4" w:space="0" w:color="F3D3A8"/>
+          <w:left w:val="single" w:sz="24" w:space="0" w:color="F28C28"/>
+          <w:bottom w:val="single" w:sz="4" w:space="0" w:color="F3D3A8"/>
+          <w:right w:val="single" w:sz="4" w:space="0" w:color="F3D3A8"/>
+        </w:tblBorders>
+        <w:tblLayout w:type="fixed"/>
+        <w:tblCellMar>
+          <w:top w:w="100" w:type="dxa"/>
+          <w:left w:w="170" w:type="dxa"/>
+          <w:bottom w:w="100" w:type="dxa"/>
+          <w:right w:w="170" w:type="dxa"/>
+        </w:tblCellMar>
+        <w:tblLook w:val="0000" w:firstRow="0" w:lastRow="0" w:firstColumn="0" w:lastColumn="0" w:noHBand="0" w:noVBand="0"/>
       </w:tblPr>
       <w:tblGrid>
-        <w:gridCol w:w="4744"/>
-        <w:gridCol w:w="4744"/>
+        <w:gridCol w:w="9449"/>
       </w:tblGrid>
       <w:tr>
         <w:trPr>
-          <w:cnfStyle w:val="100000000000" w:firstRow="1" w:lastRow="0" w:firstColumn="0" w:lastColumn="0" w:oddVBand="0" w:evenVBand="0" w:oddHBand="0" w:evenHBand="0" w:firstRowFirstColumn="0" w:firstRowLastColumn="0" w:lastRowFirstColumn="0" w:lastRowLastColumn="0"/>
+          <w:cantSplit/>
+          <w:jc w:val="center"/>
         </w:trPr>
         <w:tc>
           <w:tcPr>
-            <w:cnfStyle w:val="001000000100" w:firstRow="0" w:lastRow="0" w:firstColumn="1" w:lastColumn="0" w:oddVBand="0" w:evenVBand="0" w:oddHBand="0" w:evenHBand="0" w:firstRowFirstColumn="1" w:firstRowLastColumn="0" w:lastRowFirstColumn="0" w:lastRowLastColumn="0"/>
-            <w:tcW w:w="4744" w:type="dxa"/>
-            <w:vAlign w:val="center"/>
+            <w:tcW w:w="9449" w:type="dxa"/>
+            <w:shd w:val="clear" w:color="auto" w:fill="FFF4E0"/>
           </w:tcPr>
           <w:p>
             <w:pPr>
-              <w:pStyle w:val="NoSpacing"/>
-              <w:rPr>
-                <w:b w:val="0"/>
-                <w:bCs w:val="0"/>
-                <w:color w:val="182737"/>
-              </w:rPr>
+              <w:spacing w:after="0" w:line="264" w:lineRule="auto"/>
             </w:pPr>
             <w:r>
               <w:rPr>
-                <w:b w:val="0"/>
-                <w:bCs w:val="0"/>
-                <w:caps w:val="0"/>
-                <w:color w:val="182737"/>
-              </w:rPr>
-              <w:t xml:space="preserve">Nome </w:t>
-            </w:r>
-            <w:r>
-              <w:rPr>
-                <w:b w:val="0"/>
-                <w:bCs w:val="0"/>
-                <w:caps w:val="0"/>
-                <w:color w:val="182737"/>
-              </w:rPr>
-              <w:t>Procedimento #02:</w:t>
-            </w:r>
-          </w:p>
-        </w:tc>
-        <w:tc>
-          <w:tcPr>
-            <w:tcW w:w="4744" w:type="dxa"/>
-          </w:tcPr>
-          <w:p>
-            <w:pPr>
-              <w:pStyle w:val="NoSpacing"/>
-              <w:numPr>
-                <w:ilvl w:val="0"/>
-                <w:numId w:val="2"/>
-              </w:numPr>
-              <w:cnfStyle w:val="100000000000" w:firstRow="1" w:lastRow="0" w:firstColumn="0" w:lastColumn="0" w:oddVBand="0" w:evenVBand="0" w:oddHBand="0" w:evenHBand="0" w:firstRowFirstColumn="0" w:firstRowLastColumn="0" w:lastRowFirstColumn="0" w:lastRowLastColumn="0"/>
-              <w:rPr>
-                <w:b w:val="0"/>
-                <w:bCs w:val="0"/>
-                <w:color w:val="182737"/>
-              </w:rPr>
-            </w:pPr>
-            <w:r>
-              <w:rPr>
-                <w:b w:val="0"/>
-                <w:bCs w:val="0"/>
-                <w:caps w:val="0"/>
-                <w:color w:val="182737"/>
-                <w:lang w:val="en-US"/>
-              </w:rPr>
-              <w:t xml:space="preserve">Lorem ipsum dolor </w:t>
-            </w:r>
-            <w:proofErr w:type="gramStart"/>
-            <w:r>
-              <w:rPr>
-                <w:b w:val="0"/>
-                <w:bCs w:val="0"/>
-                <w:caps w:val="0"/>
-                <w:color w:val="182737"/>
-                <w:lang w:val="en-US"/>
-              </w:rPr>
-              <w:t>sit</w:t>
-            </w:r>
-            <w:proofErr w:type="gramEnd"/>
-            <w:r>
-              <w:rPr>
-                <w:b w:val="0"/>
-                <w:bCs w:val="0"/>
-                <w:caps w:val="0"/>
-                <w:color w:val="182737"/>
-                <w:lang w:val="en-US"/>
+                <w:b/>
+                <w:color w:val="B45309"/>
+                <w:sz w:val="21"/>
+                <w:szCs w:val="21"/>
+              </w:rPr>
+              <w:t xml:space="preserve">Passo </w:t>
+            </w:r>
+            <w:r>
+              <w:rPr>
+                <w:b/>
+                <w:color w:val="B45309"/>
+                <w:sz w:val="21"/>
+                <w:szCs w:val="21"/>
+              </w:rPr>
+              <w:t>1:</w:t>
+            </w:r>
+            <w:r>
+              <w:rPr>
+                <w:b/>
+                <w:color w:val="B45309"/>
+                <w:sz w:val="21"/>
+                <w:szCs w:val="21"/>
+              </w:rPr>
+              <w:t xml:space="preserve">  </w:t>
+            </w:r>
+            <w:r>
+              <w:rPr>
+                <w:color w:val="182737"/>
+                <w:sz w:val="21"/>
+                <w:szCs w:val="21"/>
+              </w:rPr>
+              <w:t xml:space="preserve">Lorem ipsum </w:t>
+            </w:r>
+            <w:r>
+              <w:rPr>
+                <w:color w:val="182737"/>
+                <w:sz w:val="21"/>
+                <w:szCs w:val="21"/>
+              </w:rPr>
+              <w:t>Lorem ipsum</w:t>
+            </w:r>
+            <w:r>
+              <w:rPr>
+                <w:color w:val="182737"/>
+                <w:sz w:val="21"/>
+                <w:szCs w:val="21"/>
               </w:rPr>
               <w:t xml:space="preserve"> </w:t>
             </w:r>
-            <w:proofErr w:type="spellStart"/>
-            <w:r>
-              <w:rPr>
-                <w:b w:val="0"/>
-                <w:bCs w:val="0"/>
-                <w:caps w:val="0"/>
-                <w:color w:val="182737"/>
-                <w:lang w:val="en-US"/>
-              </w:rPr>
-              <w:t>amet</w:t>
-            </w:r>
-            <w:proofErr w:type="spellEnd"/>
-            <w:r>
-              <w:rPr>
-                <w:b w:val="0"/>
-                <w:bCs w:val="0"/>
-                <w:caps w:val="0"/>
-                <w:color w:val="182737"/>
-                <w:lang w:val="en-US"/>
-              </w:rPr>
-              <w:t xml:space="preserve"> in </w:t>
-            </w:r>
-            <w:proofErr w:type="spellStart"/>
-            <w:r>
-              <w:rPr>
-                <w:b w:val="0"/>
-                <w:bCs w:val="0"/>
-                <w:caps w:val="0"/>
-                <w:color w:val="182737"/>
-                <w:lang w:val="en-US"/>
-              </w:rPr>
-              <w:t>commodo</w:t>
-            </w:r>
-            <w:proofErr w:type="spellEnd"/>
-            <w:r>
-              <w:rPr>
-                <w:b w:val="0"/>
-                <w:bCs w:val="0"/>
-                <w:caps w:val="0"/>
-                <w:color w:val="182737"/>
-                <w:lang w:val="en-US"/>
-              </w:rPr>
-              <w:t xml:space="preserve">. Ut </w:t>
-            </w:r>
-            <w:proofErr w:type="spellStart"/>
-            <w:r>
-              <w:rPr>
-                <w:b w:val="0"/>
-                <w:bCs w:val="0"/>
-                <w:caps w:val="0"/>
-                <w:color w:val="182737"/>
-                <w:lang w:val="en-US"/>
-              </w:rPr>
-              <w:t>commodo</w:t>
-            </w:r>
-            <w:proofErr w:type="spellEnd"/>
-            <w:r>
-              <w:rPr>
-                <w:b w:val="0"/>
-                <w:bCs w:val="0"/>
-                <w:caps w:val="0"/>
-                <w:color w:val="182737"/>
-                <w:lang w:val="en-US"/>
-              </w:rPr>
-              <w:t xml:space="preserve"> labore dolor </w:t>
-            </w:r>
-            <w:proofErr w:type="spellStart"/>
-            <w:r>
-              <w:rPr>
-                <w:b w:val="0"/>
-                <w:bCs w:val="0"/>
-                <w:caps w:val="0"/>
-                <w:color w:val="182737"/>
-                <w:lang w:val="en-US"/>
-              </w:rPr>
-              <w:t>deserunt</w:t>
-            </w:r>
-            <w:proofErr w:type="spellEnd"/>
-            <w:r>
-              <w:rPr>
-                <w:b w:val="0"/>
-                <w:bCs w:val="0"/>
-                <w:caps w:val="0"/>
-                <w:color w:val="182737"/>
-                <w:lang w:val="en-US"/>
-              </w:rPr>
-              <w:t xml:space="preserve"> </w:t>
-            </w:r>
-            <w:proofErr w:type="spellStart"/>
-            <w:r>
-              <w:rPr>
-                <w:b w:val="0"/>
-                <w:bCs w:val="0"/>
-                <w:caps w:val="0"/>
-                <w:color w:val="182737"/>
-                <w:lang w:val="en-US"/>
-              </w:rPr>
-              <w:t>voluptate</w:t>
-            </w:r>
-            <w:proofErr w:type="spellEnd"/>
-            <w:r>
-              <w:rPr>
-                <w:b w:val="0"/>
-                <w:bCs w:val="0"/>
-                <w:caps w:val="0"/>
-                <w:color w:val="182737"/>
-                <w:lang w:val="en-US"/>
-              </w:rPr>
-              <w:t xml:space="preserve"> non. </w:t>
-            </w:r>
-            <w:proofErr w:type="spellStart"/>
-            <w:r>
-              <w:rPr>
-                <w:b w:val="0"/>
-                <w:bCs w:val="0"/>
-                <w:caps w:val="0"/>
-                <w:color w:val="182737"/>
-              </w:rPr>
-              <w:t>Consequat</w:t>
-            </w:r>
-            <w:proofErr w:type="spellEnd"/>
-            <w:r>
-              <w:rPr>
-                <w:b w:val="0"/>
-                <w:bCs w:val="0"/>
-                <w:caps w:val="0"/>
-                <w:color w:val="182737"/>
-              </w:rPr>
-              <w:t xml:space="preserve"> </w:t>
-            </w:r>
-            <w:proofErr w:type="spellStart"/>
-            <w:r>
-              <w:rPr>
-                <w:b w:val="0"/>
-                <w:bCs w:val="0"/>
-                <w:caps w:val="0"/>
-                <w:color w:val="182737"/>
-              </w:rPr>
-              <w:t>pariatur</w:t>
-            </w:r>
-            <w:proofErr w:type="spellEnd"/>
-            <w:r>
-              <w:rPr>
-                <w:b w:val="0"/>
-                <w:bCs w:val="0"/>
-                <w:caps w:val="0"/>
-                <w:color w:val="182737"/>
-              </w:rPr>
-              <w:t xml:space="preserve"> </w:t>
-            </w:r>
-            <w:proofErr w:type="spellStart"/>
-            <w:r>
-              <w:rPr>
-                <w:b w:val="0"/>
-                <w:bCs w:val="0"/>
-                <w:caps w:val="0"/>
-                <w:color w:val="182737"/>
-              </w:rPr>
-              <w:t>lorem</w:t>
-            </w:r>
-            <w:proofErr w:type="spellEnd"/>
-            <w:r>
-              <w:rPr>
-                <w:b w:val="0"/>
-                <w:bCs w:val="0"/>
-                <w:caps w:val="0"/>
-                <w:color w:val="182737"/>
-              </w:rPr>
-              <w:t xml:space="preserve"> non </w:t>
-            </w:r>
-            <w:proofErr w:type="spellStart"/>
-            <w:r>
-              <w:rPr>
-                <w:b w:val="0"/>
-                <w:bCs w:val="0"/>
-                <w:caps w:val="0"/>
-                <w:color w:val="182737"/>
-              </w:rPr>
-              <w:t>adipiscing</w:t>
-            </w:r>
-            <w:proofErr w:type="spellEnd"/>
-            <w:r>
-              <w:rPr>
-                <w:b w:val="0"/>
-                <w:bCs w:val="0"/>
-                <w:caps w:val="0"/>
-                <w:color w:val="182737"/>
-              </w:rPr>
-              <w:t xml:space="preserve"> </w:t>
-            </w:r>
-            <w:proofErr w:type="spellStart"/>
-            <w:r>
-              <w:rPr>
-                <w:b w:val="0"/>
-                <w:bCs w:val="0"/>
-                <w:caps w:val="0"/>
-                <w:color w:val="182737"/>
-              </w:rPr>
-              <w:t>veniam</w:t>
-            </w:r>
-            <w:proofErr w:type="spellEnd"/>
-            <w:r>
-              <w:rPr>
-                <w:b w:val="0"/>
-                <w:bCs w:val="0"/>
-                <w:caps w:val="0"/>
-                <w:color w:val="182737"/>
-              </w:rPr>
-              <w:t xml:space="preserve"> </w:t>
-            </w:r>
-            <w:proofErr w:type="spellStart"/>
-            <w:r>
-              <w:rPr>
-                <w:b w:val="0"/>
-                <w:bCs w:val="0"/>
-                <w:caps w:val="0"/>
-                <w:color w:val="182737"/>
-              </w:rPr>
-              <w:t>dolor</w:t>
-            </w:r>
-            <w:proofErr w:type="spellEnd"/>
-            <w:r>
-              <w:rPr>
-                <w:b w:val="0"/>
-                <w:bCs w:val="0"/>
-                <w:caps w:val="0"/>
-                <w:color w:val="182737"/>
-              </w:rPr>
-              <w:t xml:space="preserve"> </w:t>
-            </w:r>
-            <w:proofErr w:type="spellStart"/>
-            <w:r>
-              <w:rPr>
-                <w:b w:val="0"/>
-                <w:bCs w:val="0"/>
-                <w:caps w:val="0"/>
-                <w:color w:val="182737"/>
-              </w:rPr>
-              <w:t>laborum</w:t>
-            </w:r>
-            <w:proofErr w:type="spellEnd"/>
-            <w:r>
-              <w:rPr>
-                <w:b w:val="0"/>
-                <w:bCs w:val="0"/>
-                <w:caps w:val="0"/>
-                <w:color w:val="182737"/>
-              </w:rPr>
-              <w:t xml:space="preserve"> </w:t>
-            </w:r>
-            <w:proofErr w:type="spellStart"/>
-            <w:r>
-              <w:rPr>
-                <w:b w:val="0"/>
-                <w:bCs w:val="0"/>
-                <w:caps w:val="0"/>
-                <w:color w:val="182737"/>
-              </w:rPr>
-              <w:t>cillum</w:t>
-            </w:r>
-            <w:proofErr w:type="spellEnd"/>
-            <w:r>
-              <w:rPr>
-                <w:b w:val="0"/>
-                <w:bCs w:val="0"/>
-                <w:caps w:val="0"/>
-                <w:color w:val="182737"/>
-              </w:rPr>
-              <w:t xml:space="preserve"> </w:t>
-            </w:r>
-            <w:proofErr w:type="spellStart"/>
-            <w:r>
-              <w:rPr>
-                <w:b w:val="0"/>
-                <w:bCs w:val="0"/>
-                <w:caps w:val="0"/>
-                <w:color w:val="182737"/>
-              </w:rPr>
-              <w:t>dolore</w:t>
-            </w:r>
-            <w:proofErr w:type="spellEnd"/>
-            <w:r>
-              <w:rPr>
-                <w:b w:val="0"/>
-                <w:bCs w:val="0"/>
-                <w:caps w:val="0"/>
-                <w:color w:val="182737"/>
-              </w:rPr>
-              <w:t>.</w:t>
+            <w:r>
+              <w:rPr>
+                <w:color w:val="182737"/>
+                <w:sz w:val="21"/>
+                <w:szCs w:val="21"/>
+              </w:rPr>
+              <w:t>Lorem ipsum</w:t>
+            </w:r>
+            <w:r>
+              <w:rPr>
+                <w:color w:val="182737"/>
+                <w:sz w:val="21"/>
+                <w:szCs w:val="21"/>
+              </w:rPr>
+              <w:t xml:space="preserve">, </w:t>
+            </w:r>
+            <w:r>
+              <w:rPr>
+                <w:color w:val="182737"/>
+                <w:sz w:val="21"/>
+                <w:szCs w:val="21"/>
+              </w:rPr>
+              <w:t>Lorem ipsum</w:t>
             </w:r>
           </w:p>
         </w:tc>
@@ -3505,772 +3258,13 @@
           <w:color w:val="182737"/>
         </w:rPr>
       </w:pPr>
-    </w:p>
-    <w:tbl>
-      <w:tblPr>
-        <w:tblStyle w:val="PlainTable3"/>
-        <w:tblW w:w="0" w:type="auto"/>
-        <w:tblLook w:val="04A0" w:firstRow="1" w:lastRow="0" w:firstColumn="1" w:lastColumn="0" w:noHBand="0" w:noVBand="1"/>
-      </w:tblPr>
-      <w:tblGrid>
-        <w:gridCol w:w="4744"/>
-        <w:gridCol w:w="4744"/>
-      </w:tblGrid>
-      <w:tr>
-        <w:trPr>
-          <w:cnfStyle w:val="100000000000" w:firstRow="1" w:lastRow="0" w:firstColumn="0" w:lastColumn="0" w:oddVBand="0" w:evenVBand="0" w:oddHBand="0" w:evenHBand="0" w:firstRowFirstColumn="0" w:firstRowLastColumn="0" w:lastRowFirstColumn="0" w:lastRowLastColumn="0"/>
-        </w:trPr>
-        <w:tc>
-          <w:tcPr>
-            <w:cnfStyle w:val="001000000100" w:firstRow="0" w:lastRow="0" w:firstColumn="1" w:lastColumn="0" w:oddVBand="0" w:evenVBand="0" w:oddHBand="0" w:evenHBand="0" w:firstRowFirstColumn="1" w:firstRowLastColumn="0" w:lastRowFirstColumn="0" w:lastRowLastColumn="0"/>
-            <w:tcW w:w="4744" w:type="dxa"/>
-            <w:vAlign w:val="center"/>
-          </w:tcPr>
-          <w:p>
-            <w:pPr>
-              <w:pStyle w:val="NoSpacing"/>
-              <w:rPr>
-                <w:b w:val="0"/>
-                <w:bCs w:val="0"/>
-                <w:color w:val="182737"/>
-              </w:rPr>
-            </w:pPr>
-            <w:r>
-              <w:rPr>
-                <w:b w:val="0"/>
-                <w:bCs w:val="0"/>
-                <w:caps w:val="0"/>
-                <w:color w:val="182737"/>
-              </w:rPr>
-              <w:t xml:space="preserve">Nome </w:t>
-            </w:r>
-            <w:r>
-              <w:rPr>
-                <w:b w:val="0"/>
-                <w:bCs w:val="0"/>
-                <w:caps w:val="0"/>
-                <w:color w:val="182737"/>
-              </w:rPr>
-              <w:t>Procedimento #03:</w:t>
-            </w:r>
-          </w:p>
-        </w:tc>
-        <w:tc>
-          <w:tcPr>
-            <w:tcW w:w="4744" w:type="dxa"/>
-          </w:tcPr>
-          <w:p>
-            <w:pPr>
-              <w:pStyle w:val="NoSpacing"/>
-              <w:numPr>
-                <w:ilvl w:val="0"/>
-                <w:numId w:val="2"/>
-              </w:numPr>
-              <w:cnfStyle w:val="100000000000" w:firstRow="1" w:lastRow="0" w:firstColumn="0" w:lastColumn="0" w:oddVBand="0" w:evenVBand="0" w:oddHBand="0" w:evenHBand="0" w:firstRowFirstColumn="0" w:firstRowLastColumn="0" w:lastRowFirstColumn="0" w:lastRowLastColumn="0"/>
-              <w:rPr>
-                <w:b w:val="0"/>
-                <w:bCs w:val="0"/>
-                <w:color w:val="182737"/>
-              </w:rPr>
-            </w:pPr>
-            <w:r>
-              <w:rPr>
-                <w:b w:val="0"/>
-                <w:bCs w:val="0"/>
-                <w:caps w:val="0"/>
-                <w:color w:val="182737"/>
-                <w:lang w:val="en-US"/>
-              </w:rPr>
-              <w:t xml:space="preserve">Lorem ipsum dolor </w:t>
-            </w:r>
-            <w:proofErr w:type="gramStart"/>
-            <w:r>
-              <w:rPr>
-                <w:b w:val="0"/>
-                <w:bCs w:val="0"/>
-                <w:caps w:val="0"/>
-                <w:color w:val="182737"/>
-                <w:lang w:val="en-US"/>
-              </w:rPr>
-              <w:t>sit</w:t>
-            </w:r>
-            <w:proofErr w:type="gramEnd"/>
-            <w:r>
-              <w:rPr>
-                <w:b w:val="0"/>
-                <w:bCs w:val="0"/>
-                <w:caps w:val="0"/>
-                <w:color w:val="182737"/>
-                <w:lang w:val="en-US"/>
-              </w:rPr>
-              <w:t xml:space="preserve"> </w:t>
-            </w:r>
-            <w:proofErr w:type="spellStart"/>
-            <w:r>
-              <w:rPr>
-                <w:b w:val="0"/>
-                <w:bCs w:val="0"/>
-                <w:caps w:val="0"/>
-                <w:color w:val="182737"/>
-                <w:lang w:val="en-US"/>
-              </w:rPr>
-              <w:t>amet</w:t>
-            </w:r>
-            <w:proofErr w:type="spellEnd"/>
-            <w:r>
-              <w:rPr>
-                <w:b w:val="0"/>
-                <w:bCs w:val="0"/>
-                <w:caps w:val="0"/>
-                <w:color w:val="182737"/>
-                <w:lang w:val="en-US"/>
-              </w:rPr>
-              <w:t xml:space="preserve"> in </w:t>
-            </w:r>
-            <w:proofErr w:type="spellStart"/>
-            <w:r>
-              <w:rPr>
-                <w:b w:val="0"/>
-                <w:bCs w:val="0"/>
-                <w:caps w:val="0"/>
-                <w:color w:val="182737"/>
-                <w:lang w:val="en-US"/>
-              </w:rPr>
-              <w:t>commodo</w:t>
-            </w:r>
-            <w:proofErr w:type="spellEnd"/>
-            <w:r>
-              <w:rPr>
-                <w:b w:val="0"/>
-                <w:bCs w:val="0"/>
-                <w:caps w:val="0"/>
-                <w:color w:val="182737"/>
-                <w:lang w:val="en-US"/>
-              </w:rPr>
-              <w:t xml:space="preserve">. Ut </w:t>
-            </w:r>
-            <w:proofErr w:type="spellStart"/>
-            <w:r>
-              <w:rPr>
-                <w:b w:val="0"/>
-                <w:bCs w:val="0"/>
-                <w:caps w:val="0"/>
-                <w:color w:val="182737"/>
-                <w:lang w:val="en-US"/>
-              </w:rPr>
-              <w:t>commodo</w:t>
-            </w:r>
-            <w:proofErr w:type="spellEnd"/>
-            <w:r>
-              <w:rPr>
-                <w:b w:val="0"/>
-                <w:bCs w:val="0"/>
-                <w:caps w:val="0"/>
-                <w:color w:val="182737"/>
-                <w:lang w:val="en-US"/>
-              </w:rPr>
-              <w:t xml:space="preserve"> labore dolor </w:t>
-            </w:r>
-            <w:proofErr w:type="spellStart"/>
-            <w:r>
-              <w:rPr>
-                <w:b w:val="0"/>
-                <w:bCs w:val="0"/>
-                <w:caps w:val="0"/>
-                <w:color w:val="182737"/>
-                <w:lang w:val="en-US"/>
-              </w:rPr>
-              <w:t>deserunt</w:t>
-            </w:r>
-            <w:proofErr w:type="spellEnd"/>
-            <w:r>
-              <w:rPr>
-                <w:b w:val="0"/>
-                <w:bCs w:val="0"/>
-                <w:caps w:val="0"/>
-                <w:color w:val="182737"/>
-                <w:lang w:val="en-US"/>
-              </w:rPr>
-              <w:t xml:space="preserve"> </w:t>
-            </w:r>
-            <w:proofErr w:type="spellStart"/>
-            <w:r>
-              <w:rPr>
-                <w:b w:val="0"/>
-                <w:bCs w:val="0"/>
-                <w:caps w:val="0"/>
-                <w:color w:val="182737"/>
-                <w:lang w:val="en-US"/>
-              </w:rPr>
-              <w:t>voluptate</w:t>
-            </w:r>
-            <w:proofErr w:type="spellEnd"/>
-            <w:r>
-              <w:rPr>
-                <w:b w:val="0"/>
-                <w:bCs w:val="0"/>
-                <w:caps w:val="0"/>
-                <w:color w:val="182737"/>
-                <w:lang w:val="en-US"/>
-              </w:rPr>
-              <w:t xml:space="preserve"> non. </w:t>
-            </w:r>
-            <w:proofErr w:type="spellStart"/>
-            <w:r>
-              <w:rPr>
-                <w:b w:val="0"/>
-                <w:bCs w:val="0"/>
-                <w:caps w:val="0"/>
-                <w:color w:val="182737"/>
-              </w:rPr>
-              <w:t>Consequat</w:t>
-            </w:r>
-            <w:proofErr w:type="spellEnd"/>
-            <w:r>
-              <w:rPr>
-                <w:b w:val="0"/>
-                <w:bCs w:val="0"/>
-                <w:caps w:val="0"/>
-                <w:color w:val="182737"/>
-              </w:rPr>
-              <w:t xml:space="preserve"> </w:t>
-            </w:r>
-            <w:proofErr w:type="spellStart"/>
-            <w:r>
-              <w:rPr>
-                <w:b w:val="0"/>
-                <w:bCs w:val="0"/>
-                <w:caps w:val="0"/>
-                <w:color w:val="182737"/>
-              </w:rPr>
-              <w:t>pariatur</w:t>
-            </w:r>
-            <w:proofErr w:type="spellEnd"/>
-            <w:r>
-              <w:rPr>
-                <w:b w:val="0"/>
-                <w:bCs w:val="0"/>
-                <w:caps w:val="0"/>
-                <w:color w:val="182737"/>
-              </w:rPr>
-              <w:t xml:space="preserve"> </w:t>
-            </w:r>
-            <w:proofErr w:type="spellStart"/>
-            <w:r>
-              <w:rPr>
-                <w:b w:val="0"/>
-                <w:bCs w:val="0"/>
-                <w:caps w:val="0"/>
-                <w:color w:val="182737"/>
-              </w:rPr>
-              <w:t>lorem</w:t>
-            </w:r>
-            <w:proofErr w:type="spellEnd"/>
-            <w:r>
-              <w:rPr>
-                <w:b w:val="0"/>
-                <w:bCs w:val="0"/>
-                <w:caps w:val="0"/>
-                <w:color w:val="182737"/>
-              </w:rPr>
-              <w:t xml:space="preserve"> non </w:t>
-            </w:r>
-            <w:proofErr w:type="spellStart"/>
-            <w:r>
-              <w:rPr>
-                <w:b w:val="0"/>
-                <w:bCs w:val="0"/>
-                <w:caps w:val="0"/>
-                <w:color w:val="182737"/>
-              </w:rPr>
-              <w:t>adipiscing</w:t>
-            </w:r>
-            <w:proofErr w:type="spellEnd"/>
-            <w:r>
-              <w:rPr>
-                <w:b w:val="0"/>
-                <w:bCs w:val="0"/>
-                <w:caps w:val="0"/>
-                <w:color w:val="182737"/>
-              </w:rPr>
-              <w:t xml:space="preserve"> </w:t>
-            </w:r>
-            <w:proofErr w:type="spellStart"/>
-            <w:r>
-              <w:rPr>
-                <w:b w:val="0"/>
-                <w:bCs w:val="0"/>
-                <w:caps w:val="0"/>
-                <w:color w:val="182737"/>
-              </w:rPr>
-              <w:t>veniam</w:t>
-            </w:r>
-            <w:proofErr w:type="spellEnd"/>
-            <w:r>
-              <w:rPr>
-                <w:b w:val="0"/>
-                <w:bCs w:val="0"/>
-                <w:caps w:val="0"/>
-                <w:color w:val="182737"/>
-              </w:rPr>
-              <w:t xml:space="preserve"> </w:t>
-            </w:r>
-            <w:proofErr w:type="spellStart"/>
-            <w:r>
-              <w:rPr>
-                <w:b w:val="0"/>
-                <w:bCs w:val="0"/>
-                <w:caps w:val="0"/>
-                <w:color w:val="182737"/>
-              </w:rPr>
-              <w:t>dolor</w:t>
-            </w:r>
-            <w:proofErr w:type="spellEnd"/>
-            <w:r>
-              <w:rPr>
-                <w:b w:val="0"/>
-                <w:bCs w:val="0"/>
-                <w:caps w:val="0"/>
-                <w:color w:val="182737"/>
-              </w:rPr>
-              <w:t xml:space="preserve"> </w:t>
-            </w:r>
-            <w:proofErr w:type="spellStart"/>
-            <w:r>
-              <w:rPr>
-                <w:b w:val="0"/>
-                <w:bCs w:val="0"/>
-                <w:caps w:val="0"/>
-                <w:color w:val="182737"/>
-              </w:rPr>
-              <w:t>laborum</w:t>
-            </w:r>
-            <w:proofErr w:type="spellEnd"/>
-            <w:r>
-              <w:rPr>
-                <w:b w:val="0"/>
-                <w:bCs w:val="0"/>
-                <w:caps w:val="0"/>
-                <w:color w:val="182737"/>
-              </w:rPr>
-              <w:t xml:space="preserve"> </w:t>
-            </w:r>
-            <w:proofErr w:type="spellStart"/>
-            <w:r>
-              <w:rPr>
-                <w:b w:val="0"/>
-                <w:bCs w:val="0"/>
-                <w:caps w:val="0"/>
-                <w:color w:val="182737"/>
-              </w:rPr>
-              <w:t>cillum</w:t>
-            </w:r>
-            <w:proofErr w:type="spellEnd"/>
-            <w:r>
-              <w:rPr>
-                <w:b w:val="0"/>
-                <w:bCs w:val="0"/>
-                <w:caps w:val="0"/>
-                <w:color w:val="182737"/>
-              </w:rPr>
-              <w:t xml:space="preserve"> </w:t>
-            </w:r>
-            <w:proofErr w:type="spellStart"/>
-            <w:r>
-              <w:rPr>
-                <w:b w:val="0"/>
-                <w:bCs w:val="0"/>
-                <w:caps w:val="0"/>
-                <w:color w:val="182737"/>
-              </w:rPr>
-              <w:t>dolore</w:t>
-            </w:r>
-            <w:proofErr w:type="spellEnd"/>
-            <w:r>
-              <w:rPr>
-                <w:b w:val="0"/>
-                <w:bCs w:val="0"/>
-                <w:caps w:val="0"/>
-                <w:color w:val="182737"/>
-              </w:rPr>
-              <w:t>.</w:t>
-            </w:r>
-          </w:p>
-        </w:tc>
-      </w:tr>
-    </w:tbl>
-    <w:p>
-      <w:pPr>
-        <w:pStyle w:val="NoSpacing"/>
+      <w:r>
         <w:rPr>
           <w:color w:val="182737"/>
         </w:rPr>
-      </w:pPr>
+        <w:t xml:space="preserve"> </w:t>
+      </w:r>
     </w:p>
-    <w:tbl>
-      <w:tblPr>
-        <w:tblStyle w:val="PlainTable3"/>
-        <w:tblW w:w="0" w:type="auto"/>
-        <w:tblLook w:val="04A0" w:firstRow="1" w:lastRow="0" w:firstColumn="1" w:lastColumn="0" w:noHBand="0" w:noVBand="1"/>
-      </w:tblPr>
-      <w:tblGrid>
-        <w:gridCol w:w="4744"/>
-        <w:gridCol w:w="4744"/>
-      </w:tblGrid>
-      <w:tr>
-        <w:trPr>
-          <w:cnfStyle w:val="100000000000" w:firstRow="1" w:lastRow="0" w:firstColumn="0" w:lastColumn="0" w:oddVBand="0" w:evenVBand="0" w:oddHBand="0" w:evenHBand="0" w:firstRowFirstColumn="0" w:firstRowLastColumn="0" w:lastRowFirstColumn="0" w:lastRowLastColumn="0"/>
-        </w:trPr>
-        <w:tc>
-          <w:tcPr>
-            <w:cnfStyle w:val="001000000100" w:firstRow="0" w:lastRow="0" w:firstColumn="1" w:lastColumn="0" w:oddVBand="0" w:evenVBand="0" w:oddHBand="0" w:evenHBand="0" w:firstRowFirstColumn="1" w:firstRowLastColumn="0" w:lastRowFirstColumn="0" w:lastRowLastColumn="0"/>
-            <w:tcW w:w="4744" w:type="dxa"/>
-            <w:vAlign w:val="center"/>
-          </w:tcPr>
-          <w:p>
-            <w:pPr>
-              <w:pStyle w:val="NoSpacing"/>
-              <w:rPr>
-                <w:b w:val="0"/>
-                <w:bCs w:val="0"/>
-                <w:color w:val="182737"/>
-              </w:rPr>
-            </w:pPr>
-            <w:r>
-              <w:rPr>
-                <w:b w:val="0"/>
-                <w:bCs w:val="0"/>
-                <w:caps w:val="0"/>
-                <w:color w:val="182737"/>
-              </w:rPr>
-              <w:t xml:space="preserve">Nome </w:t>
-            </w:r>
-            <w:r>
-              <w:rPr>
-                <w:b w:val="0"/>
-                <w:bCs w:val="0"/>
-                <w:caps w:val="0"/>
-                <w:color w:val="182737"/>
-              </w:rPr>
-              <w:t>Procedimento #04:</w:t>
-            </w:r>
-          </w:p>
-        </w:tc>
-        <w:tc>
-          <w:tcPr>
-            <w:tcW w:w="4744" w:type="dxa"/>
-          </w:tcPr>
-          <w:p>
-            <w:pPr>
-              <w:pStyle w:val="NoSpacing"/>
-              <w:numPr>
-                <w:ilvl w:val="0"/>
-                <w:numId w:val="4"/>
-              </w:numPr>
-              <w:cnfStyle w:val="100000000000" w:firstRow="1" w:lastRow="0" w:firstColumn="0" w:lastColumn="0" w:oddVBand="0" w:evenVBand="0" w:oddHBand="0" w:evenHBand="0" w:firstRowFirstColumn="0" w:firstRowLastColumn="0" w:lastRowFirstColumn="0" w:lastRowLastColumn="0"/>
-              <w:rPr>
-                <w:b w:val="0"/>
-                <w:bCs w:val="0"/>
-                <w:color w:val="182737"/>
-              </w:rPr>
-            </w:pPr>
-            <w:r>
-              <w:rPr>
-                <w:b w:val="0"/>
-                <w:bCs w:val="0"/>
-                <w:caps w:val="0"/>
-                <w:color w:val="182737"/>
-                <w:lang w:val="en-US"/>
-              </w:rPr>
-              <w:t xml:space="preserve">Lorem ipsum dolor </w:t>
-            </w:r>
-            <w:proofErr w:type="gramStart"/>
-            <w:r>
-              <w:rPr>
-                <w:b w:val="0"/>
-                <w:bCs w:val="0"/>
-                <w:caps w:val="0"/>
-                <w:color w:val="182737"/>
-                <w:lang w:val="en-US"/>
-              </w:rPr>
-              <w:t>sit</w:t>
-            </w:r>
-            <w:proofErr w:type="gramEnd"/>
-            <w:r>
-              <w:rPr>
-                <w:b w:val="0"/>
-                <w:bCs w:val="0"/>
-                <w:caps w:val="0"/>
-                <w:color w:val="182737"/>
-                <w:lang w:val="en-US"/>
-              </w:rPr>
-              <w:t xml:space="preserve"> </w:t>
-            </w:r>
-            <w:proofErr w:type="spellStart"/>
-            <w:r>
-              <w:rPr>
-                <w:b w:val="0"/>
-                <w:bCs w:val="0"/>
-                <w:caps w:val="0"/>
-                <w:color w:val="182737"/>
-                <w:lang w:val="en-US"/>
-              </w:rPr>
-              <w:t>amet</w:t>
-            </w:r>
-            <w:proofErr w:type="spellEnd"/>
-            <w:r>
-              <w:rPr>
-                <w:b w:val="0"/>
-                <w:bCs w:val="0"/>
-                <w:caps w:val="0"/>
-                <w:color w:val="182737"/>
-                <w:lang w:val="en-US"/>
-              </w:rPr>
-              <w:t xml:space="preserve"> in </w:t>
-            </w:r>
-            <w:proofErr w:type="spellStart"/>
-            <w:r>
-              <w:rPr>
-                <w:b w:val="0"/>
-                <w:bCs w:val="0"/>
-                <w:caps w:val="0"/>
-                <w:color w:val="182737"/>
-                <w:lang w:val="en-US"/>
-              </w:rPr>
-              <w:t>commodo</w:t>
-            </w:r>
-            <w:proofErr w:type="spellEnd"/>
-            <w:r>
-              <w:rPr>
-                <w:b w:val="0"/>
-                <w:bCs w:val="0"/>
-                <w:caps w:val="0"/>
-                <w:color w:val="182737"/>
-                <w:lang w:val="en-US"/>
-              </w:rPr>
-              <w:t xml:space="preserve">. Ut </w:t>
-            </w:r>
-            <w:proofErr w:type="spellStart"/>
-            <w:r>
-              <w:rPr>
-                <w:b w:val="0"/>
-                <w:bCs w:val="0"/>
-                <w:caps w:val="0"/>
-                <w:color w:val="182737"/>
-                <w:lang w:val="en-US"/>
-              </w:rPr>
-              <w:t>commodo</w:t>
-            </w:r>
-            <w:proofErr w:type="spellEnd"/>
-            <w:r>
-              <w:rPr>
-                <w:b w:val="0"/>
-                <w:bCs w:val="0"/>
-                <w:caps w:val="0"/>
-                <w:color w:val="182737"/>
-                <w:lang w:val="en-US"/>
-              </w:rPr>
-              <w:t xml:space="preserve"> labore dolor </w:t>
-            </w:r>
-            <w:proofErr w:type="spellStart"/>
-            <w:r>
-              <w:rPr>
-                <w:b w:val="0"/>
-                <w:bCs w:val="0"/>
-                <w:caps w:val="0"/>
-                <w:color w:val="182737"/>
-                <w:lang w:val="en-US"/>
-              </w:rPr>
-              <w:t>deserunt</w:t>
-            </w:r>
-            <w:proofErr w:type="spellEnd"/>
-            <w:r>
-              <w:rPr>
-                <w:b w:val="0"/>
-                <w:bCs w:val="0"/>
-                <w:caps w:val="0"/>
-                <w:color w:val="182737"/>
-                <w:lang w:val="en-US"/>
-              </w:rPr>
-              <w:t xml:space="preserve"> </w:t>
-            </w:r>
-            <w:proofErr w:type="spellStart"/>
-            <w:r>
-              <w:rPr>
-                <w:b w:val="0"/>
-                <w:bCs w:val="0"/>
-                <w:caps w:val="0"/>
-                <w:color w:val="182737"/>
-                <w:lang w:val="en-US"/>
-              </w:rPr>
-              <w:t>voluptate</w:t>
-            </w:r>
-            <w:proofErr w:type="spellEnd"/>
-            <w:r>
-              <w:rPr>
-                <w:b w:val="0"/>
-                <w:bCs w:val="0"/>
-                <w:caps w:val="0"/>
-                <w:color w:val="182737"/>
-                <w:lang w:val="en-US"/>
-              </w:rPr>
-              <w:t xml:space="preserve"> non. </w:t>
-            </w:r>
-            <w:proofErr w:type="spellStart"/>
-            <w:r>
-              <w:rPr>
-                <w:b w:val="0"/>
-                <w:bCs w:val="0"/>
-                <w:caps w:val="0"/>
-                <w:color w:val="182737"/>
-              </w:rPr>
-              <w:t>Consequat</w:t>
-            </w:r>
-            <w:proofErr w:type="spellEnd"/>
-            <w:r>
-              <w:rPr>
-                <w:b w:val="0"/>
-                <w:bCs w:val="0"/>
-                <w:caps w:val="0"/>
-                <w:color w:val="182737"/>
-              </w:rPr>
-              <w:t xml:space="preserve"> </w:t>
-            </w:r>
-            <w:proofErr w:type="spellStart"/>
-            <w:r>
-              <w:rPr>
-                <w:b w:val="0"/>
-                <w:bCs w:val="0"/>
-                <w:caps w:val="0"/>
-                <w:color w:val="182737"/>
-              </w:rPr>
-              <w:t>pariatur</w:t>
-            </w:r>
-            <w:proofErr w:type="spellEnd"/>
-            <w:r>
-              <w:rPr>
-                <w:b w:val="0"/>
-                <w:bCs w:val="0"/>
-                <w:caps w:val="0"/>
-                <w:color w:val="182737"/>
-              </w:rPr>
-              <w:t xml:space="preserve"> </w:t>
-            </w:r>
-            <w:proofErr w:type="spellStart"/>
-            <w:r>
-              <w:rPr>
-                <w:b w:val="0"/>
-                <w:bCs w:val="0"/>
-                <w:caps w:val="0"/>
-                <w:color w:val="182737"/>
-              </w:rPr>
-              <w:t>lorem</w:t>
-            </w:r>
-            <w:proofErr w:type="spellEnd"/>
-            <w:r>
-              <w:rPr>
-                <w:b w:val="0"/>
-                <w:bCs w:val="0"/>
-                <w:caps w:val="0"/>
-                <w:color w:val="182737"/>
-              </w:rPr>
-              <w:t xml:space="preserve"> non </w:t>
-            </w:r>
-            <w:proofErr w:type="spellStart"/>
-            <w:r>
-              <w:rPr>
-                <w:b w:val="0"/>
-                <w:bCs w:val="0"/>
-                <w:caps w:val="0"/>
-                <w:color w:val="182737"/>
-              </w:rPr>
-              <w:t>adipiscing</w:t>
-            </w:r>
-            <w:proofErr w:type="spellEnd"/>
-            <w:r>
-              <w:rPr>
-                <w:b w:val="0"/>
-                <w:bCs w:val="0"/>
-                <w:caps w:val="0"/>
-                <w:color w:val="182737"/>
-              </w:rPr>
-              <w:t xml:space="preserve"> </w:t>
-            </w:r>
-            <w:proofErr w:type="spellStart"/>
-            <w:r>
-              <w:rPr>
-                <w:b w:val="0"/>
-                <w:bCs w:val="0"/>
-                <w:caps w:val="0"/>
-                <w:color w:val="182737"/>
-              </w:rPr>
-              <w:t>veniam</w:t>
-            </w:r>
-            <w:proofErr w:type="spellEnd"/>
-            <w:r>
-              <w:rPr>
-                <w:b w:val="0"/>
-                <w:bCs w:val="0"/>
-                <w:caps w:val="0"/>
-                <w:color w:val="182737"/>
-              </w:rPr>
-              <w:t xml:space="preserve"> </w:t>
-            </w:r>
-            <w:proofErr w:type="spellStart"/>
-            <w:r>
-              <w:rPr>
-                <w:b w:val="0"/>
-                <w:bCs w:val="0"/>
-                <w:caps w:val="0"/>
-                <w:color w:val="182737"/>
-              </w:rPr>
-              <w:t>dolor</w:t>
-            </w:r>
-            <w:proofErr w:type="spellEnd"/>
-            <w:r>
-              <w:rPr>
-                <w:b w:val="0"/>
-                <w:bCs w:val="0"/>
-                <w:caps w:val="0"/>
-                <w:color w:val="182737"/>
-              </w:rPr>
-              <w:t xml:space="preserve"> </w:t>
-            </w:r>
-            <w:proofErr w:type="spellStart"/>
-            <w:r>
-              <w:rPr>
-                <w:b w:val="0"/>
-                <w:bCs w:val="0"/>
-                <w:caps w:val="0"/>
-                <w:color w:val="182737"/>
-              </w:rPr>
-              <w:t>laborum</w:t>
-            </w:r>
-            <w:proofErr w:type="spellEnd"/>
-            <w:r>
-              <w:rPr>
-                <w:b w:val="0"/>
-                <w:bCs w:val="0"/>
-                <w:caps w:val="0"/>
-                <w:color w:val="182737"/>
-              </w:rPr>
-              <w:t xml:space="preserve"> </w:t>
-            </w:r>
-            <w:proofErr w:type="spellStart"/>
-            <w:r>
-              <w:rPr>
-                <w:b w:val="0"/>
-                <w:bCs w:val="0"/>
-                <w:caps w:val="0"/>
-                <w:color w:val="182737"/>
-              </w:rPr>
-              <w:t>cil</w:t>
-            </w:r>
-            <w:proofErr w:type="spellEnd"/>
-          </w:p>
-        </w:tc>
-      </w:tr>
-    </w:tbl>
     <w:p>
       <w:pPr>
         <w:pStyle w:val="NoSpacing"/>
@@ -4372,7 +3366,7 @@
               </wp:anchor>
             </w:drawing>
           </mc:Choice>
-          <mc:Fallback>
+          <mc:Fallback xmlns:w16cei="http://schemas.microsoft.com/office/word/2026/wordml/cei">
             <w:pict>
               <v:rect w14:anchorId="497599D4" id="Retângulo 3" o:spid="_x0000_s1026" style="position:absolute;margin-left:0;margin-top:6.85pt;width:476.2pt;height:4.25pt;z-index:251663360;visibility:visible;mso-wrap-style:square;mso-width-percent:0;mso-height-percent:0;mso-wrap-distance-left:9pt;mso-wrap-distance-top:0;mso-wrap-distance-right:9pt;mso-wrap-distance-bottom:0;mso-position-horizontal:center;mso-position-horizontal-relative:margin;mso-position-vertical:absolute;mso-position-vertical-relative:text;mso-width-percent:0;mso-height-percent:0;mso-width-relative:margin;mso-height-relative:margin;v-text-anchor:middle" o:gfxdata="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" fillcolor="#ff7d01" stroked="f" strokeweight="1pt">
                 <w10:wrap anchorx="margin"/>
@@ -4410,6 +3404,16 @@
           <w:szCs w:val="36"/>
         </w:rPr>
         <w:t>Históricos</w:t>
+      </w:r>
+      <w:r>
+        <w:rPr>
+          <w:b/>
+          <w:bCs/>
+          <w:color w:val="182737"/>
+          <w:sz w:val="36"/>
+          <w:szCs w:val="36"/>
+        </w:rPr>
+        <w:t xml:space="preserve"> de Revisões</w:t>
       </w:r>
     </w:p>
     <w:p>
@@ -4571,7 +3575,21 @@
               <w:rPr>
                 <w:color w:val="182737"/>
               </w:rPr>
-              <w:t>Rafael Brasil</w:t>
+              <w:t>{</w:t>
+            </w:r>
+            <w:proofErr w:type="spellStart"/>
+            <w:r>
+              <w:rPr>
+                <w:color w:val="182737"/>
+              </w:rPr>
+              <w:t>usuário_que_criou_o_pop</w:t>
+            </w:r>
+            <w:proofErr w:type="spellEnd"/>
+            <w:r>
+              <w:rPr>
+                <w:color w:val="182737"/>
+              </w:rPr>
+              <w:t>}</w:t>
             </w:r>
           </w:p>
         </w:tc>
@@ -4613,7 +3631,7 @@
       </w:r>
     </w:p>
     <w:sectPr>
-      <w:headerReference w:type="default" r:id="rId12"/>
+      <w:headerReference w:type="default" r:id="rId19"/>
       <w:pgSz w:w="11906" w:h="16838"/>
       <w:pgMar w:top="1134" w:right="1274" w:bottom="568" w:left="1134" w:header="708" w:footer="708" w:gutter="0"/>
       <w:cols w:space="708"/>
@@ -4624,7 +3642,7 @@
 </file>
 
 <file path=word/endnotes.xml><?xml version="1.0" encoding="utf-8"?>
-<w:endnotes xmlns:wpc="http://schemas.microsoft.com/office/word/2010/wordprocessingCanvas" xmlns:cx="http://schemas.microsoft.com/office/drawing/2014/chartex" xmlns:cx1="http://schemas.microsoft.com/office/drawing/2015/9/8/chartex" xmlns:cx2="http://schemas.microsoft.com/office/drawing/2015/10/21/chartex" xmlns:cx3="http://schemas.microsoft.com/office/drawing/2016/5/9/chartex" xmlns:cx4="http://schemas.microsoft.com/office/drawing/2016/5/10/chartex" xmlns:cx5="http://schemas.microsoft.com/office/drawing/2016/5/11/chartex" xmlns:cx6="http://schemas.microsoft.com/office/drawing/2016/5/12/chartex" xmlns:cx7="http://schemas.microsoft.com/office/drawing/2016/5/13/chartex" xmlns:cx8="http://schemas.microsoft.com/office/drawing/2016/5/14/chartex" xmlns:mc="http://schemas.openxmlformats.org/markup-compatibility/2006" xmlns:aink="http://schemas.microsoft.com/office/drawing/2016/ink" xmlns:am3d="http://schemas.microsoft.com/office/drawing/2017/model3d" xmlns:o="urn:schemas-microsoft-com:office:office" xmlns:oel="http://schemas.microsoft.com/office/2019/extlst" xmlns:r="http://schemas.openxmlformats.org/officeDocument/2006/relationships" xmlns:m="http://schemas.openxmlformats.org/officeDocument/2006/math" xmlns:v="urn:schemas-microsoft-com:vml" xmlns:wp14="http://schemas.microsoft.com/office/word/2010/wordprocessingDrawing" xmlns:wp="http://schemas.openxmlformats.org/drawingml/2006/wordprocessingDrawing" xmlns:w10="urn:schemas-microsoft-com:office:word" xmlns:w="http://schemas.openxmlformats.org/wordprocessingml/2006/main" xmlns:w14="http://schemas.microsoft.com/office/word/2010/wordml" xmlns:w15="http://schemas.microsoft.com/office/word/2012/wordml" xmlns:w16cei="http://schemas.microsoft.com/office/word/2026/wordml/cei" xmlns:w16cex="http://schemas.microsoft.com/office/word/2018/wordml/cex" xmlns:w16cid="http://schemas.microsoft.com/office/word/2016/wordml/cid" xmlns:w16="http://schemas.microsoft.com/office/word/2018/wordml" xmlns:w16du="http://schemas.microsoft.com/office/word/2023/wordml/word16du" xmlns:w16sdtdh="http://schemas.microsoft.com/office/word/2020/wordml/sdtdatahash" xmlns:w16sdtfl="http://schemas.microsoft.com/office/word/2024/wordml/sdtformatlock" xmlns:w16se="http://schemas.microsoft.com/office/word/2015/wordml/symex" xmlns:wpg="http://schemas.microsoft.com/office/word/2010/wordprocessingGroup" xmlns:wpi="http://schemas.microsoft.com/office/word/2010/wordprocessingInk" xmlns:wne="http://schemas.microsoft.com/office/word/2006/wordml" xmlns:wps="http://schemas.microsoft.com/office/word/2010/wordprocessingShape" mc:Ignorable="w14 w15 w16se w16cid w16 w16cex w16sdtdh w16sdtfl w16du wp14">
+<w:endnotes xmlns:wpc="http://schemas.microsoft.com/office/word/2010/wordprocessingCanvas" xmlns:cx="http://schemas.microsoft.com/office/drawing/2014/chartex" xmlns:cx1="http://schemas.microsoft.com/office/drawing/2015/9/8/chartex" xmlns:cx2="http://schemas.microsoft.com/office/drawing/2015/10/21/chartex" xmlns:cx3="http://schemas.microsoft.com/office/drawing/2016/5/9/chartex" xmlns:cx4="http://schemas.microsoft.com/office/drawing/2016/5/10/chartex" xmlns:cx5="http://schemas.microsoft.com/office/drawing/2016/5/11/chartex" xmlns:cx6="http://schemas.microsoft.com/office/drawing/2016/5/12/chartex" xmlns:cx7="http://schemas.microsoft.com/office/drawing/2016/5/13/chartex" xmlns:cx8="http://schemas.microsoft.com/office/drawing/2016/5/14/chartex" xmlns:mc="http://schemas.openxmlformats.org/markup-compatibility/2006" xmlns:aink="http://schemas.microsoft.com/office/drawing/2016/ink" xmlns:am3d="http://schemas.microsoft.com/office/drawing/2017/model3d" xmlns:o="urn:schemas-microsoft-com:office:office" xmlns:oel="http://schemas.microsoft.com/office/2019/extlst" xmlns:r="http://schemas.openxmlformats.org/officeDocument/2006/relationships" xmlns:m="http://schemas.openxmlformats.org/officeDocument/2006/math" xmlns:v="urn:schemas-microsoft-com:vml" xmlns:wp14="http://schemas.microsoft.com/office/word/2010/wordprocessingDrawing" xmlns:wp="http://schemas.openxmlformats.org/drawingml/2006/wordprocessingDrawing" xmlns:w10="urn:schemas-microsoft-com:office:word" xmlns:w="http://schemas.openxmlformats.org/wordprocessingml/2006/main" xmlns:w14="http://schemas.microsoft.com/office/word/2010/wordml" xmlns:w15="http://schemas.microsoft.com/office/word/2012/wordml" xmlns:w16cex="http://schemas.microsoft.com/office/word/2018/wordml/cex" xmlns:w16cid="http://schemas.microsoft.com/office/word/2016/wordml/cid" xmlns:w16="http://schemas.microsoft.com/office/word/2018/wordml" xmlns:w16du="http://schemas.microsoft.com/office/word/2023/wordml/word16du" xmlns:w16sdtdh="http://schemas.microsoft.com/office/word/2020/wordml/sdtdatahash" xmlns:w16sdtfl="http://schemas.microsoft.com/office/word/2024/wordml/sdtformatlock" xmlns:w16se="http://schemas.microsoft.com/office/word/2015/wordml/symex" xmlns:wpg="http://schemas.microsoft.com/office/word/2010/wordprocessingGroup" xmlns:wpi="http://schemas.microsoft.com/office/word/2010/wordprocessingInk" xmlns:wne="http://schemas.microsoft.com/office/word/2006/wordml" xmlns:wps="http://schemas.microsoft.com/office/word/2010/wordprocessingShape" mc:Ignorable="w14 w15 w16se w16cid w16 w16cex w16sdtdh w16sdtfl w16du wp14">
   <w:endnote w:type="separator" w:id="-1">
     <w:p>
       <w:pPr>
@@ -4649,7 +3667,7 @@
 </file>
 
 <file path=word/footnotes.xml><?xml version="1.0" encoding="utf-8"?>
-<w:footnotes xmlns:wpc="http://schemas.microsoft.com/office/word/2010/wordprocessingCanvas" xmlns:cx="http://schemas.microsoft.com/office/drawing/2014/chartex" xmlns:cx1="http://schemas.microsoft.com/office/drawing/2015/9/8/chartex" xmlns:cx2="http://schemas.microsoft.com/office/drawing/2015/10/21/chartex" xmlns:cx3="http://schemas.microsoft.com/office/drawing/2016/5/9/chartex" xmlns:cx4="http://schemas.microsoft.com/office/drawing/2016/5/10/chartex" xmlns:cx5="http://schemas.microsoft.com/office/drawing/2016/5/11/chartex" xmlns:cx6="http://schemas.microsoft.com/office/drawing/2016/5/12/chartex" xmlns:cx7="http://schemas.microsoft.com/office/drawing/2016/5/13/chartex" xmlns:cx8="http://schemas.microsoft.com/office/drawing/2016/5/14/chartex" xmlns:mc="http://schemas.openxmlformats.org/markup-compatibility/2006" xmlns:aink="http://schemas.microsoft.com/office/drawing/2016/ink" xmlns:am3d="http://schemas.microsoft.com/office/drawing/2017/model3d" xmlns:o="urn:schemas-microsoft-com:office:office" xmlns:oel="http://schemas.microsoft.com/office/2019/extlst" xmlns:r="http://schemas.openxmlformats.org/officeDocument/2006/relationships" xmlns:m="http://schemas.openxmlformats.org/officeDocument/2006/math" xmlns:v="urn:schemas-microsoft-com:vml" xmlns:wp14="http://schemas.microsoft.com/office/word/2010/wordprocessingDrawing" xmlns:wp="http://schemas.openxmlformats.org/drawingml/2006/wordprocessingDrawing" xmlns:w10="urn:schemas-microsoft-com:office:word" xmlns:w="http://schemas.openxmlformats.org/wordprocessingml/2006/main" xmlns:w14="http://schemas.microsoft.com/office/word/2010/wordml" xmlns:w15="http://schemas.microsoft.com/office/word/2012/wordml" xmlns:w16cei="http://schemas.microsoft.com/office/word/2026/wordml/cei" xmlns:w16cex="http://schemas.microsoft.com/office/word/2018/wordml/cex" xmlns:w16cid="http://schemas.microsoft.com/office/word/2016/wordml/cid" xmlns:w16="http://schemas.microsoft.com/office/word/2018/wordml" xmlns:w16du="http://schemas.microsoft.com/office/word/2023/wordml/word16du" xmlns:w16sdtdh="http://schemas.microsoft.com/office/word/2020/wordml/sdtdatahash" xmlns:w16sdtfl="http://schemas.microsoft.com/office/word/2024/wordml/sdtformatlock" xmlns:w16se="http://schemas.microsoft.com/office/word/2015/wordml/symex" xmlns:wpg="http://schemas.microsoft.com/office/word/2010/wordprocessingGroup" xmlns:wpi="http://schemas.microsoft.com/office/word/2010/wordprocessingInk" xmlns:wne="http://schemas.microsoft.com/office/word/2006/wordml" xmlns:wps="http://schemas.microsoft.com/office/word/2010/wordprocessingShape" mc:Ignorable="w14 w15 w16se w16cid w16 w16cex w16sdtdh w16sdtfl w16du wp14">
+<w:footnotes xmlns:wpc="http://schemas.microsoft.com/office/word/2010/wordprocessingCanvas" xmlns:cx="http://schemas.microsoft.com/office/drawing/2014/chartex" xmlns:cx1="http://schemas.microsoft.com/office/drawing/2015/9/8/chartex" xmlns:cx2="http://schemas.microsoft.com/office/drawing/2015/10/21/chartex" xmlns:cx3="http://schemas.microsoft.com/office/drawing/2016/5/9/chartex" xmlns:cx4="http://schemas.microsoft.com/office/drawing/2016/5/10/chartex" xmlns:cx5="http://schemas.microsoft.com/office/drawing/2016/5/11/chartex" xmlns:cx6="http://schemas.microsoft.com/office/drawing/2016/5/12/chartex" xmlns:cx7="http://schemas.microsoft.com/office/drawing/2016/5/13/chartex" xmlns:cx8="http://schemas.microsoft.com/office/drawing/2016/5/14/chartex" xmlns:mc="http://schemas.openxmlformats.org/markup-compatibility/2006" xmlns:aink="http://schemas.microsoft.com/office/drawing/2016/ink" xmlns:am3d="http://schemas.microsoft.com/office/drawing/2017/model3d" xmlns:o="urn:schemas-microsoft-com:office:office" xmlns:oel="http://schemas.microsoft.com/office/2019/extlst" xmlns:r="http://schemas.openxmlformats.org/officeDocument/2006/relationships" xmlns:m="http://schemas.openxmlformats.org/officeDocument/2006/math" xmlns:v="urn:schemas-microsoft-com:vml" xmlns:wp14="http://schemas.microsoft.com/office/word/2010/wordprocessingDrawing" xmlns:wp="http://schemas.openxmlformats.org/drawingml/2006/wordprocessingDrawing" xmlns:w10="urn:schemas-microsoft-com:office:word" xmlns:w="http://schemas.openxmlformats.org/wordprocessingml/2006/main" xmlns:w14="http://schemas.microsoft.com/office/word/2010/wordml" xmlns:w15="http://schemas.microsoft.com/office/word/2012/wordml" xmlns:w16cex="http://schemas.microsoft.com/office/word/2018/wordml/cex" xmlns:w16cid="http://schemas.microsoft.com/office/word/2016/wordml/cid" xmlns:w16="http://schemas.microsoft.com/office/word/2018/wordml" xmlns:w16du="http://schemas.microsoft.com/office/word/2023/wordml/word16du" xmlns:w16sdtdh="http://schemas.microsoft.com/office/word/2020/wordml/sdtdatahash" xmlns:w16sdtfl="http://schemas.microsoft.com/office/word/2024/wordml/sdtformatlock" xmlns:w16se="http://schemas.microsoft.com/office/word/2015/wordml/symex" xmlns:wpg="http://schemas.microsoft.com/office/word/2010/wordprocessingGroup" xmlns:wpi="http://schemas.microsoft.com/office/word/2010/wordprocessingInk" xmlns:wne="http://schemas.microsoft.com/office/word/2006/wordml" xmlns:wps="http://schemas.microsoft.com/office/word/2010/wordprocessingShape" mc:Ignorable="w14 w15 w16se w16cid w16 w16cex w16sdtdh w16sdtfl w16du wp14">
   <w:footnote w:type="separator" w:id="-1">
     <w:p>
       <w:pPr>
@@ -4674,7 +3692,7 @@
 </file>
 
 <file path=word/header1.xml><?xml version="1.0" encoding="utf-8"?>
-<w:hdr xmlns:wpc="http://schemas.microsoft.com/office/word/2010/wordprocessingCanvas" xmlns:cx="http://schemas.microsoft.com/office/drawing/2014/chartex" xmlns:cx1="http://schemas.microsoft.com/office/drawing/2015/9/8/chartex" xmlns:cx2="http://schemas.microsoft.com/office/drawing/2015/10/21/chartex" xmlns:cx3="http://schemas.microsoft.com/office/drawing/2016/5/9/chartex" xmlns:cx4="http://schemas.microsoft.com/office/drawing/2016/5/10/chartex" xmlns:cx5="http://schemas.microsoft.com/office/drawing/2016/5/11/chartex" xmlns:cx6="http://schemas.microsoft.com/office/drawing/2016/5/12/chartex" xmlns:cx7="http://schemas.microsoft.com/office/drawing/2016/5/13/chartex" xmlns:cx8="http://schemas.microsoft.com/office/drawing/2016/5/14/chartex" xmlns:mc="http://schemas.openxmlformats.org/markup-compatibility/2006" xmlns:aink="http://schemas.microsoft.com/office/drawing/2016/ink" xmlns:am3d="http://schemas.microsoft.com/office/drawing/2017/model3d" xmlns:o="urn:schemas-microsoft-com:office:office" xmlns:oel="http://schemas.microsoft.com/office/2019/extlst" xmlns:r="http://schemas.openxmlformats.org/officeDocument/2006/relationships" xmlns:m="http://schemas.openxmlformats.org/officeDocument/2006/math" xmlns:v="urn:schemas-microsoft-com:vml" xmlns:wp14="http://schemas.microsoft.com/office/word/2010/wordprocessingDrawing" xmlns:wp="http://schemas.openxmlformats.org/drawingml/2006/wordprocessingDrawing" xmlns:w10="urn:schemas-microsoft-com:office:word" xmlns:w="http://schemas.openxmlformats.org/wordprocessingml/2006/main" xmlns:w14="http://schemas.microsoft.com/office/word/2010/wordml" xmlns:w15="http://schemas.microsoft.com/office/word/2012/wordml" xmlns:w16cei="http://schemas.microsoft.com/office/word/2026/wordml/cei" xmlns:w16cex="http://schemas.microsoft.com/office/word/2018/wordml/cex" xmlns:w16cid="http://schemas.microsoft.com/office/word/2016/wordml/cid" xmlns:w16="http://schemas.microsoft.com/office/word/2018/wordml" xmlns:w16du="http://schemas.microsoft.com/office/word/2023/wordml/word16du" xmlns:w16sdtdh="http://schemas.microsoft.com/office/word/2020/wordml/sdtdatahash" xmlns:w16sdtfl="http://schemas.microsoft.com/office/word/2024/wordml/sdtformatlock" xmlns:w16se="http://schemas.microsoft.com/office/word/2015/wordml/symex" xmlns:wpg="http://schemas.microsoft.com/office/word/2010/wordprocessingGroup" xmlns:wpi="http://schemas.microsoft.com/office/word/2010/wordprocessingInk" xmlns:wne="http://schemas.microsoft.com/office/word/2006/wordml" xmlns:wps="http://schemas.microsoft.com/office/word/2010/wordprocessingShape" mc:Ignorable="w14 w15 w16se w16cid w16 w16cex w16sdtdh w16sdtfl w16du wp14">
+<w:hdr xmlns:wpc="http://schemas.microsoft.com/office/word/2010/wordprocessingCanvas" xmlns:cx="http://schemas.microsoft.com/office/drawing/2014/chartex" xmlns:cx1="http://schemas.microsoft.com/office/drawing/2015/9/8/chartex" xmlns:cx2="http://schemas.microsoft.com/office/drawing/2015/10/21/chartex" xmlns:cx3="http://schemas.microsoft.com/office/drawing/2016/5/9/chartex" xmlns:cx4="http://schemas.microsoft.com/office/drawing/2016/5/10/chartex" xmlns:cx5="http://schemas.microsoft.com/office/drawing/2016/5/11/chartex" xmlns:cx6="http://schemas.microsoft.com/office/drawing/2016/5/12/chartex" xmlns:cx7="http://schemas.microsoft.com/office/drawing/2016/5/13/chartex" xmlns:cx8="http://schemas.microsoft.com/office/drawing/2016/5/14/chartex" xmlns:mc="http://schemas.openxmlformats.org/markup-compatibility/2006" xmlns:aink="http://schemas.microsoft.com/office/drawing/2016/ink" xmlns:am3d="http://schemas.microsoft.com/office/drawing/2017/model3d" xmlns:o="urn:schemas-microsoft-com:office:office" xmlns:oel="http://schemas.microsoft.com/office/2019/extlst" xmlns:r="http://schemas.openxmlformats.org/officeDocument/2006/relationships" xmlns:m="http://schemas.openxmlformats.org/officeDocument/2006/math" xmlns:v="urn:schemas-microsoft-com:vml" xmlns:wp14="http://schemas.microsoft.com/office/word/2010/wordprocessingDrawing" xmlns:wp="http://schemas.openxmlformats.org/drawingml/2006/wordprocessingDrawing" xmlns:w10="urn:schemas-microsoft-com:office:word" xmlns:w="http://schemas.openxmlformats.org/wordprocessingml/2006/main" xmlns:w14="http://schemas.microsoft.com/office/word/2010/wordml" xmlns:w15="http://schemas.microsoft.com/office/word/2012/wordml" xmlns:w16cex="http://schemas.microsoft.com/office/word/2018/wordml/cex" xmlns:w16cid="http://schemas.microsoft.com/office/word/2016/wordml/cid" xmlns:w16="http://schemas.microsoft.com/office/word/2018/wordml" xmlns:w16du="http://schemas.microsoft.com/office/word/2023/wordml/word16du" xmlns:w16sdtdh="http://schemas.microsoft.com/office/word/2020/wordml/sdtdatahash" xmlns:w16sdtfl="http://schemas.microsoft.com/office/word/2024/wordml/sdtformatlock" xmlns:w16se="http://schemas.microsoft.com/office/word/2015/wordml/symex" xmlns:wpg="http://schemas.microsoft.com/office/word/2010/wordprocessingGroup" xmlns:wpi="http://schemas.microsoft.com/office/word/2010/wordprocessingInk" xmlns:wne="http://schemas.microsoft.com/office/word/2006/wordml" xmlns:wps="http://schemas.microsoft.com/office/word/2010/wordprocessingShape" mc:Ignorable="w14 w15 w16se w16cid w16 w16cex w16sdtdh w16sdtfl w16du wp14">
   <w:p>
     <w:pPr>
       <w:pStyle w:val="Header"/>
@@ -4692,7 +3710,7 @@
 </file>
 
 <file path=word/numbering.xml><?xml version="1.0" encoding="utf-8"?>
-<w:numbering xmlns:wpc="http://schemas.microsoft.com/office/word/2010/wordprocessingCanvas" xmlns:cx="http://schemas.microsoft.com/office/drawing/2014/chartex" xmlns:cx1="http://schemas.microsoft.com/office/drawing/2015/9/8/chartex" xmlns:cx2="http://schemas.microsoft.com/office/drawing/2015/10/21/chartex" xmlns:cx3="http://schemas.microsoft.com/office/drawing/2016/5/9/chartex" xmlns:cx4="http://schemas.microsoft.com/office/drawing/2016/5/10/chartex" xmlns:cx5="http://schemas.microsoft.com/office/drawing/2016/5/11/chartex" xmlns:cx6="http://schemas.microsoft.com/office/drawing/2016/5/12/chartex" xmlns:cx7="http://schemas.microsoft.com/office/drawing/2016/5/13/chartex" xmlns:cx8="http://schemas.microsoft.com/office/drawing/2016/5/14/chartex" xmlns:mc="http://schemas.openxmlformats.org/markup-compatibility/2006" xmlns:aink="http://schemas.microsoft.com/office/drawing/2016/ink" xmlns:am3d="http://schemas.microsoft.com/office/drawing/2017/model3d" xmlns:o="urn:schemas-microsoft-com:office:office" xmlns:oel="http://schemas.microsoft.com/office/2019/extlst" xmlns:r="http://schemas.openxmlformats.org/officeDocument/2006/relationships" xmlns:m="http://schemas.openxmlformats.org/officeDocument/2006/math" xmlns:v="urn:schemas-microsoft-com:vml" xmlns:wp14="http://schemas.microsoft.com/office/word/2010/wordprocessingDrawing" xmlns:wp="http://schemas.openxmlformats.org/drawingml/2006/wordprocessingDrawing" xmlns:w10="urn:schemas-microsoft-com:office:word" xmlns:w="http://schemas.openxmlformats.org/wordprocessingml/2006/main" xmlns:w14="http://schemas.microsoft.com/office/word/2010/wordml" xmlns:w15="http://schemas.microsoft.com/office/word/2012/wordml" xmlns:w16cei="http://schemas.microsoft.com/office/word/2026/wordml/cei" xmlns:w16cex="http://schemas.microsoft.com/office/word/2018/wordml/cex" xmlns:w16cid="http://schemas.microsoft.com/office/word/2016/wordml/cid" xmlns:w16="http://schemas.microsoft.com/office/word/2018/wordml" xmlns:w16du="http://schemas.microsoft.com/office/word/2023/wordml/word16du" xmlns:w16sdtdh="http://schemas.microsoft.com/office/word/2020/wordml/sdtdatahash" xmlns:w16sdtfl="http://schemas.microsoft.com/office/word/2024/wordml/sdtformatlock" xmlns:w16se="http://schemas.microsoft.com/office/word/2015/wordml/symex" xmlns:wpg="http://schemas.microsoft.com/office/word/2010/wordprocessingGroup" xmlns:wpi="http://schemas.microsoft.com/office/word/2010/wordprocessingInk" xmlns:wne="http://schemas.microsoft.com/office/word/2006/wordml" xmlns:wps="http://schemas.microsoft.com/office/word/2010/wordprocessingShape" mc:Ignorable="w14 w15 w16se w16cid w16 w16cex w16sdtdh w16sdtfl w16du wp14">
+<w:numbering xmlns:wpc="http://schemas.microsoft.com/office/word/2010/wordprocessingCanvas" xmlns:cx="http://schemas.microsoft.com/office/drawing/2014/chartex" xmlns:cx1="http://schemas.microsoft.com/office/drawing/2015/9/8/chartex" xmlns:cx2="http://schemas.microsoft.com/office/drawing/2015/10/21/chartex" xmlns:cx3="http://schemas.microsoft.com/office/drawing/2016/5/9/chartex" xmlns:cx4="http://schemas.microsoft.com/office/drawing/2016/5/10/chartex" xmlns:cx5="http://schemas.microsoft.com/office/drawing/2016/5/11/chartex" xmlns:cx6="http://schemas.microsoft.com/office/drawing/2016/5/12/chartex" xmlns:cx7="http://schemas.microsoft.com/office/drawing/2016/5/13/chartex" xmlns:cx8="http://schemas.microsoft.com/office/drawing/2016/5/14/chartex" xmlns:mc="http://schemas.openxmlformats.org/markup-compatibility/2006" xmlns:aink="http://schemas.microsoft.com/office/drawing/2016/ink" xmlns:am3d="http://schemas.microsoft.com/office/drawing/2017/model3d" xmlns:o="urn:schemas-microsoft-com:office:office" xmlns:oel="http://schemas.microsoft.com/office/2019/extlst" xmlns:r="http://schemas.openxmlformats.org/officeDocument/2006/relationships" xmlns:m="http://schemas.openxmlformats.org/officeDocument/2006/math" xmlns:v="urn:schemas-microsoft-com:vml" xmlns:wp14="http://schemas.microsoft.com/office/word/2010/wordprocessingDrawing" xmlns:wp="http://schemas.openxmlformats.org/drawingml/2006/wordprocessingDrawing" xmlns:w10="urn:schemas-microsoft-com:office:word" xmlns:w="http://schemas.openxmlformats.org/wordprocessingml/2006/main" xmlns:w14="http://schemas.microsoft.com/office/word/2010/wordml" xmlns:w15="http://schemas.microsoft.com/office/word/2012/wordml" xmlns:w16cex="http://schemas.microsoft.com/office/word/2018/wordml/cex" xmlns:w16cid="http://schemas.microsoft.com/office/word/2016/wordml/cid" xmlns:w16="http://schemas.microsoft.com/office/word/2018/wordml" xmlns:w16du="http://schemas.microsoft.com/office/word/2023/wordml/word16du" xmlns:w16sdtdh="http://schemas.microsoft.com/office/word/2020/wordml/sdtdatahash" xmlns:w16sdtfl="http://schemas.microsoft.com/office/word/2024/wordml/sdtformatlock" xmlns:w16se="http://schemas.microsoft.com/office/word/2015/wordml/symex" xmlns:wpg="http://schemas.microsoft.com/office/word/2010/wordprocessingGroup" xmlns:wpi="http://schemas.microsoft.com/office/word/2010/wordprocessingInk" xmlns:wne="http://schemas.microsoft.com/office/word/2006/wordml" xmlns:wps="http://schemas.microsoft.com/office/word/2010/wordprocessingShape" mc:Ignorable="w14 w15 w16se w16cid w16 w16cex w16sdtdh w16sdtfl w16du wp14">
   <w:abstractNum w:abstractNumId="0" w15:restartNumberingAfterBreak="0">
     <w:nsid w:val="100E2541"/>
     <w:multiLevelType w:val="hybridMultilevel"/>

</xml_diff>